<commit_message>
docs: update resume with 100% clickable PDF hyperlinks and Nifty100 project
</commit_message>
<xml_diff>
--- a/portfolio/assets/Mahdi_Nawaz_Resume.docx
+++ b/portfolio/assets/Mahdi_Nawaz_Resume.docx
@@ -14,7 +14,7 @@
           <w:b/>
           <w:i w:val="0"/>
           <w:color w:val="000000"/>
-          <w:sz w:val="28"/>
+          <w:sz w:val="27"/>
         </w:rPr>
         <w:t>MAHDI NAWAZ</w:t>
         <w:br/>
@@ -25,7 +25,7 @@
           <w:b w:val="0"/>
           <w:i w:val="0"/>
           <w:color w:val="000000"/>
-          <w:sz w:val="19"/>
+          <w:sz w:val="18"/>
         </w:rPr>
         <w:t xml:space="preserve">Kashmir, India | +91-9682309169 | </w:t>
       </w:r>
@@ -34,7 +34,7 @@
           <w:rPr>
             <w:color w:val="000000"/>
             <w:u w:val="single"/>
-            <w:sz w:val="19"/>
+            <w:sz w:val="18"/>
             <w:rFonts w:ascii="Times New Roman" w:hAnsi="Times New Roman"/>
           </w:rPr>
           <w:t>mahdienawaz@gmail.com</w:t>
@@ -46,7 +46,7 @@
           <w:b w:val="0"/>
           <w:i w:val="0"/>
           <w:color w:val="000000"/>
-          <w:sz w:val="19"/>
+          <w:sz w:val="18"/>
         </w:rPr>
         <w:t xml:space="preserve"> | </w:t>
       </w:r>
@@ -55,7 +55,7 @@
           <w:rPr>
             <w:color w:val="000000"/>
             <w:u w:val="single"/>
-            <w:sz w:val="19"/>
+            <w:sz w:val="18"/>
             <w:rFonts w:ascii="Times New Roman" w:hAnsi="Times New Roman"/>
           </w:rPr>
           <w:t>Portfolio</w:t>
@@ -67,7 +67,7 @@
           <w:b w:val="0"/>
           <w:i w:val="0"/>
           <w:color w:val="000000"/>
-          <w:sz w:val="19"/>
+          <w:sz w:val="18"/>
         </w:rPr>
         <w:t xml:space="preserve"> | </w:t>
       </w:r>
@@ -76,7 +76,7 @@
           <w:rPr>
             <w:color w:val="000000"/>
             <w:u w:val="single"/>
-            <w:sz w:val="19"/>
+            <w:sz w:val="18"/>
             <w:rFonts w:ascii="Times New Roman" w:hAnsi="Times New Roman"/>
           </w:rPr>
           <w:t>LinkedIn</w:t>
@@ -88,7 +88,7 @@
           <w:b w:val="0"/>
           <w:i w:val="0"/>
           <w:color w:val="000000"/>
-          <w:sz w:val="19"/>
+          <w:sz w:val="18"/>
         </w:rPr>
         <w:t xml:space="preserve"> | </w:t>
       </w:r>
@@ -97,7 +97,7 @@
           <w:rPr>
             <w:color w:val="000000"/>
             <w:u w:val="single"/>
-            <w:sz w:val="19"/>
+            <w:sz w:val="18"/>
             <w:rFonts w:ascii="Times New Roman" w:hAnsi="Times New Roman"/>
           </w:rPr>
           <w:t>GitHub</w:t>
@@ -109,7 +109,7 @@
           <w:b w:val="0"/>
           <w:i w:val="0"/>
           <w:color w:val="000000"/>
-          <w:sz w:val="19"/>
+          <w:sz w:val="18"/>
         </w:rPr>
         <w:t xml:space="preserve"> | Open to Relocation</w:t>
       </w:r>
@@ -119,7 +119,7 @@
         <w:pBdr>
           <w:bottom w:val="single" w:sz="6" w:space="1" w:color="000000"/>
         </w:pBdr>
-        <w:spacing w:before="80" w:after="30" w:line="240" w:lineRule="auto"/>
+        <w:spacing w:before="70" w:after="30" w:line="240" w:lineRule="auto"/>
       </w:pPr>
       <w:r>
         <w:rPr>
@@ -127,7 +127,7 @@
           <w:b/>
           <w:i w:val="0"/>
           <w:color w:val="000000"/>
-          <w:sz w:val="20"/>
+          <w:sz w:val="19"/>
         </w:rPr>
         <w:t>PROFESSIONAL SUMMARY</w:t>
       </w:r>
@@ -137,7 +137,7 @@
         <w:pBdr>
           <w:bottom w:val="single" w:sz="6" w:space="1" w:color="000000"/>
         </w:pBdr>
-        <w:spacing w:before="20" w:after="50" w:line="252" w:lineRule="auto"/>
+        <w:spacing w:before="20" w:after="40" w:line="252" w:lineRule="auto"/>
         <w:jc w:val="both"/>
         <w:rPr>
           <w:rFonts w:ascii="Times New Roman" w:hAnsi="Times New Roman"/>
@@ -151,7 +151,7 @@
           <w:b w:val="0"/>
           <w:i w:val="0"/>
           <w:color w:val="000000"/>
-          <w:sz w:val="19"/>
+          <w:sz w:val="18"/>
         </w:rPr>
         <w:t>AI/ML &amp; Data Analytics Specialist (B.Tech CSE – AI &amp; ML, 2027) bridging machine learning, LLMs, and business intelligence, with prior fintech internship experience across Python, SQL, and Power BI. Proven ability to turn complex datasets (100K+ rows) into automated reporting pipelines, predictive risk models, and production-deployed web applications. Seeking an AI/ML or Data Analytics internship to engineer scalable data solutions and drive high-stakes business decisions.</w:t>
       </w:r>
@@ -161,7 +161,7 @@
         <w:pBdr>
           <w:bottom w:val="single" w:sz="6" w:space="1" w:color="000000"/>
         </w:pBdr>
-        <w:spacing w:before="80" w:after="30" w:line="240" w:lineRule="auto"/>
+        <w:spacing w:before="70" w:after="30" w:line="240" w:lineRule="auto"/>
       </w:pPr>
       <w:r>
         <w:rPr>
@@ -169,14 +169,14 @@
           <w:b/>
           <w:i w:val="0"/>
           <w:color w:val="000000"/>
-          <w:sz w:val="20"/>
+          <w:sz w:val="19"/>
         </w:rPr>
         <w:t>TECHNICAL SKILLS</w:t>
       </w:r>
     </w:p>
     <w:p>
       <w:pPr>
-        <w:spacing w:after="24" w:line="240" w:lineRule="auto" w:before="0"/>
+        <w:spacing w:after="20" w:line="240" w:lineRule="auto" w:before="0"/>
         <w:ind w:left="173"/>
       </w:pPr>
       <w:r/>
@@ -186,7 +186,7 @@
           <w:b/>
           <w:i w:val="0"/>
           <w:color w:val="000000"/>
-          <w:sz w:val="19"/>
+          <w:sz w:val="18"/>
         </w:rPr>
         <w:t xml:space="preserve">• Querying &amp; Analysis: </w:t>
       </w:r>
@@ -196,14 +196,14 @@
           <w:b w:val="0"/>
           <w:i w:val="0"/>
           <w:color w:val="000000"/>
-          <w:sz w:val="19"/>
+          <w:sz w:val="18"/>
         </w:rPr>
         <w:t>SQL (MySQL, PostgreSQL: CTEs, Window Functions, Joins), Python (Pandas, NumPy), Advanced Excel (Power Query, DAX, Pivot Tables), ETL Pipelines</w:t>
       </w:r>
     </w:p>
     <w:p>
       <w:pPr>
-        <w:spacing w:after="24" w:line="240" w:lineRule="auto" w:before="0"/>
+        <w:spacing w:after="20" w:line="240" w:lineRule="auto" w:before="0"/>
         <w:ind w:left="173"/>
       </w:pPr>
       <w:r/>
@@ -213,7 +213,7 @@
           <w:b/>
           <w:i w:val="0"/>
           <w:color w:val="000000"/>
-          <w:sz w:val="19"/>
+          <w:sz w:val="18"/>
         </w:rPr>
         <w:t xml:space="preserve">• BI &amp; Visualization: </w:t>
       </w:r>
@@ -223,14 +223,14 @@
           <w:b w:val="0"/>
           <w:i w:val="0"/>
           <w:color w:val="000000"/>
-          <w:sz w:val="19"/>
+          <w:sz w:val="18"/>
         </w:rPr>
         <w:t>Power BI (Data Modeling, DAX Measures), Microsoft Fabric, Streamlit, Plotly, Interactive KPI Dashboards, Matplotlib, Seaborn</w:t>
       </w:r>
     </w:p>
     <w:p>
       <w:pPr>
-        <w:spacing w:after="24" w:line="240" w:lineRule="auto" w:before="0"/>
+        <w:spacing w:after="20" w:line="240" w:lineRule="auto" w:before="0"/>
         <w:ind w:left="173"/>
       </w:pPr>
       <w:r/>
@@ -240,7 +240,7 @@
           <w:b/>
           <w:i w:val="0"/>
           <w:color w:val="000000"/>
-          <w:sz w:val="19"/>
+          <w:sz w:val="18"/>
         </w:rPr>
         <w:t xml:space="preserve">• Machine Learning &amp; AI: </w:t>
       </w:r>
@@ -250,7 +250,7 @@
           <w:b w:val="0"/>
           <w:i w:val="0"/>
           <w:color w:val="000000"/>
-          <w:sz w:val="19"/>
+          <w:sz w:val="18"/>
         </w:rPr>
         <w:t>Scikit-learn, XGBoost, Meta Prophet, Monte Carlo Simulation, LLMs &amp; RAG (Gemini AI), FastF1, Anomaly Detection (Isolation Forest, PCA), Git</w:t>
       </w:r>
@@ -260,7 +260,7 @@
         <w:pBdr>
           <w:bottom w:val="single" w:sz="6" w:space="1" w:color="000000"/>
         </w:pBdr>
-        <w:spacing w:before="80" w:after="30" w:line="240" w:lineRule="auto"/>
+        <w:spacing w:before="70" w:after="30" w:line="240" w:lineRule="auto"/>
       </w:pPr>
       <w:r>
         <w:rPr>
@@ -268,7 +268,7 @@
           <w:b/>
           <w:i w:val="0"/>
           <w:color w:val="000000"/>
-          <w:sz w:val="20"/>
+          <w:sz w:val="19"/>
         </w:rPr>
         <w:t>PROFESSIONAL EXPERIENCE</w:t>
       </w:r>
@@ -283,7 +283,7 @@
           <w:b/>
           <w:i w:val="0"/>
           <w:color w:val="000000"/>
-          <w:sz w:val="19"/>
+          <w:sz w:val="18"/>
         </w:rPr>
         <w:t xml:space="preserve">Data Analyst Intern </w:t>
       </w:r>
@@ -292,7 +292,7 @@
           <w:rFonts w:ascii="Times New Roman" w:hAnsi="Times New Roman"/>
           <w:i w:val="0"/>
           <w:color w:val="000000"/>
-          <w:sz w:val="19"/>
+          <w:sz w:val="18"/>
         </w:rPr>
         <w:t>| Bluestock Fintech / Uptricks Services Pvt. Ltd. (Pune / Remote)</w:t>
       </w:r>
@@ -302,7 +302,7 @@
           <w:b/>
           <w:i w:val="0"/>
           <w:color w:val="000000"/>
-          <w:sz w:val="19"/>
+          <w:sz w:val="18"/>
         </w:rPr>
         <w:tab/>
         <w:t>May 2026 – Nov 2026</w:t>
@@ -310,7 +310,7 @@
     </w:p>
     <w:p>
       <w:pPr>
-        <w:spacing w:after="40" w:line="240" w:lineRule="auto" w:before="0"/>
+        <w:spacing w:after="36" w:line="240" w:lineRule="auto" w:before="0"/>
         <w:ind w:left="173"/>
       </w:pPr>
       <w:r/>
@@ -320,7 +320,7 @@
           <w:b w:val="0"/>
           <w:i w:val="0"/>
           <w:color w:val="000000"/>
-          <w:sz w:val="19"/>
+          <w:sz w:val="17"/>
         </w:rPr>
         <w:t>• Analyzed multi-asset portfolio data using Python and SQL (Sharpe ratio, drawdown, volatility risk metrics); automated ETL pipelines and developed interactive Power BI KPI dashboards for fund performance.</w:t>
       </w:r>
@@ -335,7 +335,7 @@
           <w:b/>
           <w:i w:val="0"/>
           <w:color w:val="000000"/>
-          <w:sz w:val="19"/>
+          <w:sz w:val="18"/>
         </w:rPr>
         <w:t xml:space="preserve">Data Analytics Summer Intern </w:t>
       </w:r>
@@ -344,7 +344,7 @@
           <w:rFonts w:ascii="Times New Roman" w:hAnsi="Times New Roman"/>
           <w:i w:val="0"/>
           <w:color w:val="000000"/>
-          <w:sz w:val="19"/>
+          <w:sz w:val="18"/>
         </w:rPr>
         <w:t>| Recimotech Solutions (Srinagar, J&amp;K)</w:t>
       </w:r>
@@ -354,7 +354,7 @@
           <w:b/>
           <w:i w:val="0"/>
           <w:color w:val="000000"/>
-          <w:sz w:val="19"/>
+          <w:sz w:val="18"/>
         </w:rPr>
         <w:tab/>
         <w:t>Jun 2026 – Aug 2026</w:t>
@@ -362,7 +362,7 @@
     </w:p>
     <w:p>
       <w:pPr>
-        <w:spacing w:after="40" w:line="240" w:lineRule="auto" w:before="0"/>
+        <w:spacing w:after="36" w:line="240" w:lineRule="auto" w:before="0"/>
         <w:ind w:left="173"/>
       </w:pPr>
       <w:r/>
@@ -372,7 +372,7 @@
           <w:b w:val="0"/>
           <w:i w:val="0"/>
           <w:color w:val="000000"/>
-          <w:sz w:val="19"/>
+          <w:sz w:val="17"/>
         </w:rPr>
         <w:t>• Handled end-to-end ETL workflows, data cleaning, and relational SQL queries to engineer operational BI visualization dashboards, cutting reporting cycle time.</w:t>
       </w:r>
@@ -382,7 +382,7 @@
         <w:pBdr>
           <w:bottom w:val="single" w:sz="6" w:space="1" w:color="000000"/>
         </w:pBdr>
-        <w:spacing w:before="80" w:after="30" w:line="240" w:lineRule="auto"/>
+        <w:spacing w:before="70" w:after="30" w:line="240" w:lineRule="auto"/>
       </w:pPr>
       <w:r>
         <w:rPr>
@@ -390,7 +390,7 @@
           <w:b/>
           <w:i w:val="0"/>
           <w:color w:val="000000"/>
-          <w:sz w:val="20"/>
+          <w:sz w:val="19"/>
         </w:rPr>
         <w:t>TECHNICAL PROJECTS</w:t>
       </w:r>
@@ -406,7 +406,7 @@
           <w:b/>
           <w:i w:val="0"/>
           <w:color w:val="000000"/>
-          <w:sz w:val="19"/>
+          <w:sz w:val="18"/>
         </w:rPr>
         <w:t xml:space="preserve">DataMind AI – Intelligent CSV/Excel Analytics Assistant </w:t>
       </w:r>
@@ -416,7 +416,7 @@
           <w:b w:val="0"/>
           <w:i w:val="0"/>
           <w:color w:val="000000"/>
-          <w:sz w:val="18"/>
+          <w:sz w:val="17"/>
         </w:rPr>
         <w:t xml:space="preserve">| Python, Pandas, Plotly, Streamlit, LLMs | </w:t>
       </w:r>
@@ -425,7 +425,7 @@
           <w:rPr>
             <w:color w:val="000000"/>
             <w:u w:val="single"/>
-            <w:sz w:val="18"/>
+            <w:sz w:val="17"/>
             <w:rFonts w:ascii="Times New Roman" w:hAnsi="Times New Roman"/>
           </w:rPr>
           <w:t>[Live Demo]</w:t>
@@ -434,7 +434,7 @@
     </w:p>
     <w:p>
       <w:pPr>
-        <w:spacing w:after="24" w:line="240" w:lineRule="auto" w:before="0"/>
+        <w:spacing w:after="20" w:line="240" w:lineRule="auto" w:before="0"/>
         <w:ind w:left="173"/>
       </w:pPr>
       <w:r/>
@@ -444,9 +444,9 @@
           <w:b w:val="0"/>
           <w:i w:val="0"/>
           <w:color w:val="000000"/>
-          <w:sz w:val="18"/>
+          <w:sz w:val="17"/>
         </w:rPr>
-        <w:t>• Built an AI-driven data intelligence assistant converting natural language queries into verified Pandas code, automated data profiling, interactive Plotly charts, and Gemini LLM summaries.</w:t>
+        <w:t>• Built an AI-driven tool converting natural language queries into verified Pandas code, interactive Plotly charts, and automated summaries.</w:t>
       </w:r>
     </w:p>
     <w:p>
@@ -460,7 +460,7 @@
           <w:b/>
           <w:i w:val="0"/>
           <w:color w:val="000000"/>
-          <w:sz w:val="19"/>
+          <w:sz w:val="18"/>
         </w:rPr>
         <w:t xml:space="preserve">MFAnalytica – Mutual Fund Analytics Platform </w:t>
       </w:r>
@@ -470,16 +470,16 @@
           <w:b w:val="0"/>
           <w:i w:val="0"/>
           <w:color w:val="000000"/>
-          <w:sz w:val="18"/>
+          <w:sz w:val="17"/>
         </w:rPr>
-        <w:t xml:space="preserve">| Python, Meta Prophet, Monte Carlo, Gemini AI, Streamlit | </w:t>
+        <w:t xml:space="preserve">| Python, Meta Prophet, Monte Carlo, Gemini AI | </w:t>
       </w:r>
       <w:hyperlink r:id="rId20">
         <w:r>
           <w:rPr>
             <w:color w:val="000000"/>
             <w:u w:val="single"/>
-            <w:sz w:val="18"/>
+            <w:sz w:val="17"/>
             <w:rFonts w:ascii="Times New Roman" w:hAnsi="Times New Roman"/>
           </w:rPr>
           <w:t>[Live Demo]</w:t>
@@ -488,7 +488,7 @@
     </w:p>
     <w:p>
       <w:pPr>
-        <w:spacing w:after="24" w:line="240" w:lineRule="auto" w:before="0"/>
+        <w:spacing w:after="20" w:line="240" w:lineRule="auto" w:before="0"/>
         <w:ind w:left="173"/>
       </w:pPr>
       <w:r/>
@@ -498,9 +498,9 @@
           <w:b w:val="0"/>
           <w:i w:val="0"/>
           <w:color w:val="000000"/>
-          <w:sz w:val="18"/>
+          <w:sz w:val="17"/>
         </w:rPr>
-        <w:t>• Developed an intelligent fund platform featuring Meta Prophet time-series forecasting, 2,000-path Monte Carlo risk simulations, and a RAG-based Gemini AI assistant with 3D-PCA anomaly detection.</w:t>
+        <w:t>• Developed an intelligent fund platform featuring Meta Prophet time-series forecasting, 2,000-path Monte Carlo risk simulations, and a RAG-based Gemini AI assistant for automated portfolio recommendations.</w:t>
       </w:r>
     </w:p>
     <w:p>
@@ -514,9 +514,9 @@
           <w:b/>
           <w:i w:val="0"/>
           <w:color w:val="000000"/>
-          <w:sz w:val="19"/>
+          <w:sz w:val="18"/>
         </w:rPr>
-        <w:t xml:space="preserve">Customer Churn Prediction &amp; Retention Analytics </w:t>
+        <w:t xml:space="preserve">Nifty100 Financial Intelligence Platform </w:t>
       </w:r>
       <w:r>
         <w:rPr>
@@ -524,16 +524,16 @@
           <w:b w:val="0"/>
           <w:i w:val="0"/>
           <w:color w:val="000000"/>
-          <w:sz w:val="18"/>
+          <w:sz w:val="17"/>
         </w:rPr>
-        <w:t xml:space="preserve">| SQL, Python, XGBoost, Streamlit, Power BI | </w:t>
+        <w:t xml:space="preserve">| Python, Pandas, Streamlit, FastAPI, ML | </w:t>
       </w:r>
-      <w:hyperlink r:id="rId11">
+      <w:hyperlink r:id="rId20">
         <w:r>
           <w:rPr>
             <w:color w:val="000000"/>
             <w:u w:val="single"/>
-            <w:sz w:val="18"/>
+            <w:sz w:val="17"/>
             <w:rFonts w:ascii="Times New Roman" w:hAnsi="Times New Roman"/>
           </w:rPr>
           <w:t>[Live Demo]</w:t>
@@ -542,7 +542,7 @@
     </w:p>
     <w:p>
       <w:pPr>
-        <w:spacing w:after="24" w:line="240" w:lineRule="auto" w:before="0"/>
+        <w:spacing w:after="20" w:line="240" w:lineRule="auto" w:before="0"/>
         <w:ind w:left="173"/>
       </w:pPr>
       <w:r/>
@@ -552,9 +552,9 @@
           <w:b w:val="0"/>
           <w:i w:val="0"/>
           <w:color w:val="000000"/>
-          <w:sz w:val="18"/>
+          <w:sz w:val="17"/>
         </w:rPr>
-        <w:t>• Modeled churn risk across 7,000+ customer records using an XGBoost classifier (84.2% ROC-AUC); deployed a live risk-tracking dashboard with interactive what-if retention scenario modeling.</w:t>
+        <w:t>• Engineered an automated stock intelligence engine for 90+ Nifty 100 tickers using Isolation Forest, 3D-PCA anomaly detection, and Monte Carlo risk valuation.</w:t>
       </w:r>
     </w:p>
     <w:p>
@@ -568,9 +568,9 @@
           <w:b/>
           <w:i w:val="0"/>
           <w:color w:val="000000"/>
-          <w:sz w:val="19"/>
+          <w:sz w:val="18"/>
         </w:rPr>
-        <w:t xml:space="preserve">Bengaluru Ola Ride Operations Analytics </w:t>
+        <w:t xml:space="preserve">Customer Churn Prediction &amp; Retention Analytics </w:t>
       </w:r>
       <w:r>
         <w:rPr>
@@ -578,16 +578,16 @@
           <w:b w:val="0"/>
           <w:i w:val="0"/>
           <w:color w:val="000000"/>
-          <w:sz w:val="18"/>
+          <w:sz w:val="17"/>
         </w:rPr>
-        <w:t xml:space="preserve">| SQL, Python, Power BI, XGBoost | </w:t>
+        <w:t xml:space="preserve">| SQL, Python, XGBoost, Streamlit, Power BI | </w:t>
       </w:r>
-      <w:hyperlink r:id="rId21">
+      <w:hyperlink r:id="rId11">
         <w:r>
           <w:rPr>
             <w:color w:val="000000"/>
             <w:u w:val="single"/>
-            <w:sz w:val="18"/>
+            <w:sz w:val="17"/>
             <w:rFonts w:ascii="Times New Roman" w:hAnsi="Times New Roman"/>
           </w:rPr>
           <w:t>[Live Demo]</w:t>
@@ -596,7 +596,7 @@
     </w:p>
     <w:p>
       <w:pPr>
-        <w:spacing w:after="24" w:line="240" w:lineRule="auto" w:before="0"/>
+        <w:spacing w:after="20" w:line="240" w:lineRule="auto" w:before="0"/>
         <w:ind w:left="173"/>
       </w:pPr>
       <w:r/>
@@ -606,9 +606,9 @@
           <w:b w:val="0"/>
           <w:i w:val="0"/>
           <w:color w:val="000000"/>
-          <w:sz w:val="18"/>
+          <w:sz w:val="17"/>
         </w:rPr>
-        <w:t>• Analyzed 100K+ Bengaluru ride records using SQL and Python to isolate cancellation hotspots; developed an interactive Power BI dashboard integrated with an XGBoost predictive model (R² 0.89).</w:t>
+        <w:t>• Identified churn risk across 7,000+ customers using an XGBoost classifier; deployed a live risk-tracking dashboard to protect vulnerable ARR.</w:t>
       </w:r>
     </w:p>
     <w:p>
@@ -622,9 +622,9 @@
           <w:b/>
           <w:i w:val="0"/>
           <w:color w:val="000000"/>
-          <w:sz w:val="19"/>
+          <w:sz w:val="18"/>
         </w:rPr>
-        <w:t xml:space="preserve">Hospital Readmission Analysis System </w:t>
+        <w:t xml:space="preserve">Bengaluru Ola Ride Operations Analytics </w:t>
       </w:r>
       <w:r>
         <w:rPr>
@@ -632,16 +632,16 @@
           <w:b w:val="0"/>
           <w:i w:val="0"/>
           <w:color w:val="000000"/>
-          <w:sz w:val="18"/>
+          <w:sz w:val="17"/>
         </w:rPr>
-        <w:t xml:space="preserve">| Python, Pandas, Scikit-learn, Seaborn, Streamlit | </w:t>
+        <w:t xml:space="preserve">| SQL, Python, Power BI, XGBoost | </w:t>
       </w:r>
-      <w:hyperlink r:id="rId12">
+      <w:hyperlink r:id="rId21">
         <w:r>
           <w:rPr>
             <w:color w:val="000000"/>
             <w:u w:val="single"/>
-            <w:sz w:val="18"/>
+            <w:sz w:val="17"/>
             <w:rFonts w:ascii="Times New Roman" w:hAnsi="Times New Roman"/>
           </w:rPr>
           <w:t>[Live Demo]</w:t>
@@ -650,7 +650,7 @@
     </w:p>
     <w:p>
       <w:pPr>
-        <w:spacing w:after="24" w:line="240" w:lineRule="auto" w:before="0"/>
+        <w:spacing w:after="20" w:line="240" w:lineRule="auto" w:before="0"/>
         <w:ind w:left="173"/>
       </w:pPr>
       <w:r/>
@@ -660,9 +660,9 @@
           <w:b w:val="0"/>
           <w:i w:val="0"/>
           <w:color w:val="000000"/>
-          <w:sz w:val="18"/>
+          <w:sz w:val="17"/>
         </w:rPr>
-        <w:t>• Modeled clinical indicators across 15,000+ patient records to isolate key readmission drivers and deployed an interactive risk screening application for clinical decision support.</w:t>
+        <w:t>• Analyzed 100K+ trip records to uncover peak-hour cancellation bottlenecks; built an operational Power BI dashboard and ML cancellation forecast.</w:t>
       </w:r>
     </w:p>
     <w:p>
@@ -676,9 +676,9 @@
           <w:b/>
           <w:i w:val="0"/>
           <w:color w:val="000000"/>
-          <w:sz w:val="19"/>
+          <w:sz w:val="18"/>
         </w:rPr>
-        <w:t xml:space="preserve">F1 Strategy &amp; Telemetry Analytics Dashboard </w:t>
+        <w:t xml:space="preserve">Hospital Readmission Analysis System </w:t>
       </w:r>
       <w:r>
         <w:rPr>
@@ -686,16 +686,16 @@
           <w:b w:val="0"/>
           <w:i w:val="0"/>
           <w:color w:val="000000"/>
-          <w:sz w:val="18"/>
+          <w:sz w:val="17"/>
         </w:rPr>
-        <w:t xml:space="preserve">| Python, Plotly, FastF1, Streamlit | </w:t>
+        <w:t xml:space="preserve">| Python, Pandas, Seaborn, Streamlit | </w:t>
       </w:r>
-      <w:hyperlink r:id="rId22">
+      <w:hyperlink r:id="rId12">
         <w:r>
           <w:rPr>
             <w:color w:val="000000"/>
             <w:u w:val="single"/>
-            <w:sz w:val="18"/>
+            <w:sz w:val="17"/>
             <w:rFonts w:ascii="Times New Roman" w:hAnsi="Times New Roman"/>
           </w:rPr>
           <w:t>[Live Demo]</w:t>
@@ -704,7 +704,7 @@
     </w:p>
     <w:p>
       <w:pPr>
-        <w:spacing w:after="24" w:line="240" w:lineRule="auto" w:before="0"/>
+        <w:spacing w:after="20" w:line="240" w:lineRule="auto" w:before="0"/>
         <w:ind w:left="173"/>
       </w:pPr>
       <w:r/>
@@ -714,9 +714,9 @@
           <w:b w:val="0"/>
           <w:i w:val="0"/>
           <w:color w:val="000000"/>
-          <w:sz w:val="18"/>
+          <w:sz w:val="17"/>
         </w:rPr>
-        <w:t>• Visualized micro-sector speed telemetry, tyre degradation dynamics, and circuit grip evolution across Grand Prix race sessions using the FastF1 API and interactive Plotly visualizer.</w:t>
+        <w:t>• Modeled clinical indicators across 15,000+ patient records to isolate key readmission drivers and deployed an interactive risk screening tool.</w:t>
       </w:r>
     </w:p>
     <w:p>
@@ -730,7 +730,61 @@
           <w:b/>
           <w:i w:val="0"/>
           <w:color w:val="000000"/>
-          <w:sz w:val="19"/>
+          <w:sz w:val="18"/>
+        </w:rPr>
+        <w:t xml:space="preserve">F1 Strategy &amp; Telemetry Analytics Dashboard </w:t>
+      </w:r>
+      <w:r>
+        <w:rPr>
+          <w:rFonts w:ascii="Times New Roman" w:hAnsi="Times New Roman"/>
+          <w:b w:val="0"/>
+          <w:i w:val="0"/>
+          <w:color w:val="000000"/>
+          <w:sz w:val="17"/>
+        </w:rPr>
+        <w:t xml:space="preserve">| Python, Plotly, FastF1, Streamlit | </w:t>
+      </w:r>
+      <w:hyperlink r:id="rId22">
+        <w:r>
+          <w:rPr>
+            <w:color w:val="000000"/>
+            <w:u w:val="single"/>
+            <w:sz w:val="17"/>
+            <w:rFonts w:ascii="Times New Roman" w:hAnsi="Times New Roman"/>
+          </w:rPr>
+          <w:t>[Live Demo]</w:t>
+        </w:r>
+      </w:hyperlink>
+    </w:p>
+    <w:p>
+      <w:pPr>
+        <w:spacing w:after="20" w:line="240" w:lineRule="auto" w:before="0"/>
+        <w:ind w:left="173"/>
+      </w:pPr>
+      <w:r/>
+      <w:r>
+        <w:rPr>
+          <w:rFonts w:ascii="Times New Roman" w:hAnsi="Times New Roman"/>
+          <w:b w:val="0"/>
+          <w:i w:val="0"/>
+          <w:color w:val="000000"/>
+          <w:sz w:val="17"/>
+        </w:rPr>
+        <w:t>• Visualized micro-sector speed telemetry, tyre degradation dynamics, and circuit grip evolution across Grand Prix sessions.</w:t>
+      </w:r>
+    </w:p>
+    <w:p>
+      <w:pPr>
+        <w:spacing w:before="30" w:after="0" w:line="240" w:lineRule="auto"/>
+      </w:pPr>
+      <w:r/>
+      <w:r>
+        <w:rPr>
+          <w:rFonts w:ascii="Times New Roman" w:hAnsi="Times New Roman"/>
+          <w:b/>
+          <w:i w:val="0"/>
+          <w:color w:val="000000"/>
+          <w:sz w:val="18"/>
         </w:rPr>
         <w:t xml:space="preserve">FarmSight – Crop Price &amp; Weather Correlation Analysis </w:t>
       </w:r>
@@ -740,7 +794,7 @@
           <w:b w:val="0"/>
           <w:i w:val="0"/>
           <w:color w:val="000000"/>
-          <w:sz w:val="18"/>
+          <w:sz w:val="17"/>
         </w:rPr>
         <w:t xml:space="preserve">| Python, Streamlit, Excel, Power BI | </w:t>
       </w:r>
@@ -749,7 +803,7 @@
           <w:rPr>
             <w:color w:val="000000"/>
             <w:u w:val="single"/>
-            <w:sz w:val="18"/>
+            <w:sz w:val="17"/>
             <w:rFonts w:ascii="Times New Roman" w:hAnsi="Times New Roman"/>
           </w:rPr>
           <w:t>[Live Demo]</w:t>
@@ -758,8 +812,7 @@
     </w:p>
     <w:p>
       <w:pPr>
-        <w:spacing w:after="24" w:line="240" w:lineRule="auto" w:before="0"/>
-        <w:ind w:left="173"/>
+        <w:spacing w:before="0" w:after="20" w:line="240" w:lineRule="auto"/>
       </w:pPr>
       <w:r/>
       <w:r>
@@ -768,9 +821,9 @@
           <w:b w:val="0"/>
           <w:i w:val="0"/>
           <w:color w:val="000000"/>
-          <w:sz w:val="18"/>
+          <w:sz w:val="17"/>
         </w:rPr>
-        <w:t>• Correlated historical mandi agricultural spot prices with precipitation patterns to model price elasticity and seasonality trends using Python, Excel, and Power BI.</w:t>
+        <w:t>• Correlated historical mandi crop spot prices with precipitation patterns to model price elasticity and seasonality trends.</w:t>
       </w:r>
     </w:p>
     <w:p>
@@ -778,7 +831,7 @@
         <w:pBdr>
           <w:bottom w:val="single" w:sz="6" w:space="1" w:color="000000"/>
         </w:pBdr>
-        <w:spacing w:before="80" w:after="30" w:line="240" w:lineRule="auto"/>
+        <w:spacing w:before="70" w:after="30" w:line="240" w:lineRule="auto"/>
       </w:pPr>
       <w:r>
         <w:rPr>
@@ -786,14 +839,14 @@
           <w:b/>
           <w:i w:val="0"/>
           <w:color w:val="000000"/>
-          <w:sz w:val="20"/>
+          <w:sz w:val="19"/>
         </w:rPr>
         <w:t>EDUCATION</w:t>
       </w:r>
     </w:p>
     <w:p>
       <w:pPr>
-        <w:spacing w:before="30" w:after="30" w:line="240" w:lineRule="auto"/>
+        <w:spacing w:before="30" w:after="24" w:line="240" w:lineRule="auto"/>
       </w:pPr>
       <w:r/>
       <w:r>
@@ -802,7 +855,7 @@
           <w:b/>
           <w:i w:val="0"/>
           <w:color w:val="000000"/>
-          <w:sz w:val="19"/>
+          <w:sz w:val="18"/>
         </w:rPr>
         <w:t xml:space="preserve">B.Tech in Computer Science &amp; Engineering (AI &amp; ML) </w:t>
       </w:r>
@@ -812,7 +865,7 @@
           <w:b w:val="0"/>
           <w:i w:val="0"/>
           <w:color w:val="000000"/>
-          <w:sz w:val="19"/>
+          <w:sz w:val="18"/>
         </w:rPr>
         <w:t>— GNA University, Punjab</w:t>
       </w:r>
@@ -822,7 +875,7 @@
           <w:b/>
           <w:i w:val="0"/>
           <w:color w:val="000000"/>
-          <w:sz w:val="19"/>
+          <w:sz w:val="18"/>
         </w:rPr>
         <w:tab/>
         <w:t>2023 – 2027</w:t>
@@ -834,7 +887,7 @@
           <w:b w:val="0"/>
           <w:i w:val="0"/>
           <w:color w:val="000000"/>
-          <w:sz w:val="18"/>
+          <w:sz w:val="17"/>
         </w:rPr>
         <w:t>Relevant Coursework: Data Warehousing &amp; Data Mining, Machine Learning, DBMS (SQL), Data Analytics, Data Structures &amp; Algorithms, Statistics &amp; Probability</w:t>
       </w:r>
@@ -844,7 +897,7 @@
         <w:pBdr>
           <w:bottom w:val="single" w:sz="6" w:space="1" w:color="000000"/>
         </w:pBdr>
-        <w:spacing w:before="80" w:after="30" w:line="240" w:lineRule="auto"/>
+        <w:spacing w:before="70" w:after="30" w:line="240" w:lineRule="auto"/>
       </w:pPr>
       <w:r>
         <w:rPr>
@@ -852,14 +905,14 @@
           <w:b/>
           <w:i w:val="0"/>
           <w:color w:val="000000"/>
-          <w:sz w:val="20"/>
+          <w:sz w:val="19"/>
         </w:rPr>
         <w:t>CERTIFICATIONS &amp; TRAINING</w:t>
       </w:r>
     </w:p>
     <w:p>
       <w:pPr>
-        <w:spacing w:after="20" w:line="240" w:lineRule="auto" w:before="0"/>
+        <w:spacing w:after="16" w:line="240" w:lineRule="auto" w:before="0"/>
         <w:ind w:left="173"/>
       </w:pPr>
       <w:r/>
@@ -869,7 +922,7 @@
           <w:b/>
           <w:i w:val="0"/>
           <w:color w:val="000000"/>
-          <w:sz w:val="19"/>
+          <w:sz w:val="18"/>
         </w:rPr>
         <w:t xml:space="preserve">• Microsoft Learn: </w:t>
       </w:r>
@@ -879,14 +932,14 @@
           <w:b w:val="0"/>
           <w:i w:val="0"/>
           <w:color w:val="000000"/>
-          <w:sz w:val="18"/>
+          <w:sz w:val="17"/>
         </w:rPr>
         <w:t>Introduction to End-to-End Analytics using Microsoft Fabric | Clean, Transform &amp; Load Data in Power BI | Get Data with Power BI</w:t>
       </w:r>
     </w:p>
     <w:p>
       <w:pPr>
-        <w:spacing w:after="20" w:line="240" w:lineRule="auto" w:before="0"/>
+        <w:spacing w:after="16" w:line="240" w:lineRule="auto" w:before="0"/>
         <w:ind w:left="173"/>
       </w:pPr>
       <w:r/>
@@ -896,7 +949,7 @@
           <w:b/>
           <w:i w:val="0"/>
           <w:color w:val="000000"/>
-          <w:sz w:val="19"/>
+          <w:sz w:val="18"/>
         </w:rPr>
         <w:t xml:space="preserve">• Enterprise Simulations (Forage): </w:t>
       </w:r>
@@ -906,14 +959,14 @@
           <w:b w:val="0"/>
           <w:i w:val="0"/>
           <w:color w:val="000000"/>
-          <w:sz w:val="18"/>
+          <w:sz w:val="17"/>
         </w:rPr>
         <w:t>Deloitte Data Analytics | Tata GenAI-Powered Data Analytics</w:t>
       </w:r>
     </w:p>
     <w:p>
       <w:pPr>
-        <w:spacing w:after="20" w:line="240" w:lineRule="auto" w:before="0"/>
+        <w:spacing w:after="16" w:line="240" w:lineRule="auto" w:before="0"/>
         <w:ind w:left="173"/>
       </w:pPr>
       <w:r/>
@@ -923,7 +976,7 @@
           <w:b/>
           <w:i w:val="0"/>
           <w:color w:val="000000"/>
-          <w:sz w:val="19"/>
+          <w:sz w:val="18"/>
         </w:rPr>
         <w:t xml:space="preserve">• Technical &amp; AI Credentials: </w:t>
       </w:r>
@@ -933,14 +986,14 @@
           <w:b w:val="0"/>
           <w:i w:val="0"/>
           <w:color w:val="000000"/>
-          <w:sz w:val="18"/>
+          <w:sz w:val="17"/>
         </w:rPr>
         <w:t>Govt. of India / NSDC Skill India Computer Vision (2026) | Be10x AI Tools &amp; ChatGPT (2026) | Python for Data Science</w:t>
       </w:r>
     </w:p>
     <w:sectPr>
       <w:pgSz w:w="12240" w:h="15840"/>
-      <w:pgMar w:top="360" w:right="600" w:bottom="360" w:left="600" w:header="720" w:footer="720" w:gutter="0"/>
+      <w:pgMar w:top="320" w:right="560" w:bottom="320" w:left="560" w:header="720" w:footer="720" w:gutter="0"/>
       <w:cols w:space="720"/>
       <w:docGrid w:linePitch="360"/>
     </w:sectPr>

</xml_diff>

<commit_message>
docs: add Sahaara AI and GyaanBuddy to 1-page resume
</commit_message>
<xml_diff>
--- a/portfolio/assets/Mahdi_Nawaz_Resume.docx
+++ b/portfolio/assets/Mahdi_Nawaz_Resume.docx
@@ -4,7 +4,7 @@
   <w:body>
     <w:p>
       <w:pPr>
-        <w:spacing w:after="40" w:line="240" w:lineRule="auto" w:before="0"/>
+        <w:spacing w:after="30" w:line="240" w:lineRule="auto" w:before="0"/>
         <w:jc w:val="center"/>
       </w:pPr>
       <w:r/>
@@ -14,7 +14,7 @@
           <w:b/>
           <w:i w:val="0"/>
           <w:color w:val="000000"/>
-          <w:sz w:val="27"/>
+          <w:sz w:val="26"/>
         </w:rPr>
         <w:t>MAHDI NAWAZ</w:t>
         <w:br/>
@@ -25,7 +25,7 @@
           <w:b w:val="0"/>
           <w:i w:val="0"/>
           <w:color w:val="000000"/>
-          <w:sz w:val="18"/>
+          <w:sz w:val="17"/>
         </w:rPr>
         <w:t xml:space="preserve">Kashmir, India | +91-9682309169 | </w:t>
       </w:r>
@@ -34,7 +34,7 @@
           <w:rPr>
             <w:color w:val="000000"/>
             <w:u w:val="single"/>
-            <w:sz w:val="18"/>
+            <w:sz w:val="17"/>
             <w:rFonts w:ascii="Times New Roman" w:hAnsi="Times New Roman"/>
           </w:rPr>
           <w:t>mahdienawaz@gmail.com</w:t>
@@ -46,7 +46,7 @@
           <w:b w:val="0"/>
           <w:i w:val="0"/>
           <w:color w:val="000000"/>
-          <w:sz w:val="18"/>
+          <w:sz w:val="17"/>
         </w:rPr>
         <w:t xml:space="preserve"> | </w:t>
       </w:r>
@@ -55,7 +55,7 @@
           <w:rPr>
             <w:color w:val="000000"/>
             <w:u w:val="single"/>
-            <w:sz w:val="18"/>
+            <w:sz w:val="17"/>
             <w:rFonts w:ascii="Times New Roman" w:hAnsi="Times New Roman"/>
           </w:rPr>
           <w:t>Portfolio</w:t>
@@ -67,7 +67,7 @@
           <w:b w:val="0"/>
           <w:i w:val="0"/>
           <w:color w:val="000000"/>
-          <w:sz w:val="18"/>
+          <w:sz w:val="17"/>
         </w:rPr>
         <w:t xml:space="preserve"> | </w:t>
       </w:r>
@@ -76,7 +76,7 @@
           <w:rPr>
             <w:color w:val="000000"/>
             <w:u w:val="single"/>
-            <w:sz w:val="18"/>
+            <w:sz w:val="17"/>
             <w:rFonts w:ascii="Times New Roman" w:hAnsi="Times New Roman"/>
           </w:rPr>
           <w:t>LinkedIn</w:t>
@@ -88,7 +88,7 @@
           <w:b w:val="0"/>
           <w:i w:val="0"/>
           <w:color w:val="000000"/>
-          <w:sz w:val="18"/>
+          <w:sz w:val="17"/>
         </w:rPr>
         <w:t xml:space="preserve"> | </w:t>
       </w:r>
@@ -97,7 +97,7 @@
           <w:rPr>
             <w:color w:val="000000"/>
             <w:u w:val="single"/>
-            <w:sz w:val="18"/>
+            <w:sz w:val="17"/>
             <w:rFonts w:ascii="Times New Roman" w:hAnsi="Times New Roman"/>
           </w:rPr>
           <w:t>GitHub</w:t>
@@ -109,7 +109,7 @@
           <w:b w:val="0"/>
           <w:i w:val="0"/>
           <w:color w:val="000000"/>
-          <w:sz w:val="18"/>
+          <w:sz w:val="17"/>
         </w:rPr>
         <w:t xml:space="preserve"> | Open to Relocation</w:t>
       </w:r>
@@ -119,7 +119,7 @@
         <w:pBdr>
           <w:bottom w:val="single" w:sz="6" w:space="1" w:color="000000"/>
         </w:pBdr>
-        <w:spacing w:before="70" w:after="30" w:line="240" w:lineRule="auto"/>
+        <w:spacing w:before="60" w:after="20" w:line="240" w:lineRule="auto"/>
       </w:pPr>
       <w:r>
         <w:rPr>
@@ -127,7 +127,7 @@
           <w:b/>
           <w:i w:val="0"/>
           <w:color w:val="000000"/>
-          <w:sz w:val="19"/>
+          <w:sz w:val="18"/>
         </w:rPr>
         <w:t>PROFESSIONAL SUMMARY</w:t>
       </w:r>
@@ -137,7 +137,7 @@
         <w:pBdr>
           <w:bottom w:val="single" w:sz="6" w:space="1" w:color="000000"/>
         </w:pBdr>
-        <w:spacing w:before="20" w:after="40" w:line="252" w:lineRule="auto"/>
+        <w:spacing w:before="10" w:after="30" w:line="245" w:lineRule="auto"/>
         <w:jc w:val="both"/>
         <w:rPr>
           <w:rFonts w:ascii="Times New Roman" w:hAnsi="Times New Roman"/>
@@ -151,7 +151,7 @@
           <w:b w:val="0"/>
           <w:i w:val="0"/>
           <w:color w:val="000000"/>
-          <w:sz w:val="18"/>
+          <w:sz w:val="17"/>
         </w:rPr>
         <w:t>AI/ML &amp; Data Analytics Specialist (B.Tech CSE – AI &amp; ML, 2027) bridging machine learning, LLMs, and business intelligence, with prior fintech internship experience across Python, SQL, and Power BI. Proven ability to turn complex datasets (100K+ rows) into automated reporting pipelines, predictive risk models, and production-deployed web applications. Seeking an AI/ML or Data Analytics internship to engineer scalable data solutions and drive high-stakes business decisions.</w:t>
       </w:r>
@@ -161,121 +161,7 @@
         <w:pBdr>
           <w:bottom w:val="single" w:sz="6" w:space="1" w:color="000000"/>
         </w:pBdr>
-        <w:spacing w:before="70" w:after="30" w:line="240" w:lineRule="auto"/>
-      </w:pPr>
-      <w:r>
-        <w:rPr>
-          <w:rFonts w:ascii="Times New Roman" w:hAnsi="Times New Roman"/>
-          <w:b/>
-          <w:i w:val="0"/>
-          <w:color w:val="000000"/>
-          <w:sz w:val="19"/>
-        </w:rPr>
-        <w:t>TECHNICAL SKILLS</w:t>
-      </w:r>
-    </w:p>
-    <w:p>
-      <w:pPr>
-        <w:spacing w:after="20" w:line="240" w:lineRule="auto" w:before="0"/>
-        <w:ind w:left="173"/>
-      </w:pPr>
-      <w:r/>
-      <w:r>
-        <w:rPr>
-          <w:rFonts w:ascii="Times New Roman" w:hAnsi="Times New Roman"/>
-          <w:b/>
-          <w:i w:val="0"/>
-          <w:color w:val="000000"/>
-          <w:sz w:val="18"/>
-        </w:rPr>
-        <w:t xml:space="preserve">• Querying &amp; Analysis: </w:t>
-      </w:r>
-      <w:r>
-        <w:rPr>
-          <w:rFonts w:ascii="Times New Roman" w:hAnsi="Times New Roman"/>
-          <w:b w:val="0"/>
-          <w:i w:val="0"/>
-          <w:color w:val="000000"/>
-          <w:sz w:val="18"/>
-        </w:rPr>
-        <w:t>SQL (MySQL, PostgreSQL: CTEs, Window Functions, Joins), Python (Pandas, NumPy), Advanced Excel (Power Query, DAX, Pivot Tables), ETL Pipelines</w:t>
-      </w:r>
-    </w:p>
-    <w:p>
-      <w:pPr>
-        <w:spacing w:after="20" w:line="240" w:lineRule="auto" w:before="0"/>
-        <w:ind w:left="173"/>
-      </w:pPr>
-      <w:r/>
-      <w:r>
-        <w:rPr>
-          <w:rFonts w:ascii="Times New Roman" w:hAnsi="Times New Roman"/>
-          <w:b/>
-          <w:i w:val="0"/>
-          <w:color w:val="000000"/>
-          <w:sz w:val="18"/>
-        </w:rPr>
-        <w:t xml:space="preserve">• BI &amp; Visualization: </w:t>
-      </w:r>
-      <w:r>
-        <w:rPr>
-          <w:rFonts w:ascii="Times New Roman" w:hAnsi="Times New Roman"/>
-          <w:b w:val="0"/>
-          <w:i w:val="0"/>
-          <w:color w:val="000000"/>
-          <w:sz w:val="18"/>
-        </w:rPr>
-        <w:t>Power BI (Data Modeling, DAX Measures), Microsoft Fabric, Streamlit, Plotly, Interactive KPI Dashboards, Matplotlib, Seaborn</w:t>
-      </w:r>
-    </w:p>
-    <w:p>
-      <w:pPr>
-        <w:spacing w:after="20" w:line="240" w:lineRule="auto" w:before="0"/>
-        <w:ind w:left="173"/>
-      </w:pPr>
-      <w:r/>
-      <w:r>
-        <w:rPr>
-          <w:rFonts w:ascii="Times New Roman" w:hAnsi="Times New Roman"/>
-          <w:b/>
-          <w:i w:val="0"/>
-          <w:color w:val="000000"/>
-          <w:sz w:val="18"/>
-        </w:rPr>
-        <w:t xml:space="preserve">• Machine Learning &amp; AI: </w:t>
-      </w:r>
-      <w:r>
-        <w:rPr>
-          <w:rFonts w:ascii="Times New Roman" w:hAnsi="Times New Roman"/>
-          <w:b w:val="0"/>
-          <w:i w:val="0"/>
-          <w:color w:val="000000"/>
-          <w:sz w:val="18"/>
-        </w:rPr>
-        <w:t>Scikit-learn, XGBoost, Meta Prophet, Monte Carlo Simulation, LLMs &amp; RAG (Gemini AI), FastF1, Anomaly Detection (Isolation Forest, PCA), Git</w:t>
-      </w:r>
-    </w:p>
-    <w:p>
-      <w:pPr>
-        <w:pBdr>
-          <w:bottom w:val="single" w:sz="6" w:space="1" w:color="000000"/>
-        </w:pBdr>
-        <w:spacing w:before="70" w:after="30" w:line="240" w:lineRule="auto"/>
-      </w:pPr>
-      <w:r>
-        <w:rPr>
-          <w:rFonts w:ascii="Times New Roman" w:hAnsi="Times New Roman"/>
-          <w:b/>
-          <w:i w:val="0"/>
-          <w:color w:val="000000"/>
-          <w:sz w:val="19"/>
-        </w:rPr>
-        <w:t>PROFESSIONAL EXPERIENCE</w:t>
-      </w:r>
-    </w:p>
-    <w:p>
-      <w:pPr>
-        <w:spacing w:before="30" w:after="10" w:line="240" w:lineRule="auto"/>
+        <w:spacing w:before="60" w:after="20" w:line="240" w:lineRule="auto"/>
       </w:pPr>
       <w:r>
         <w:rPr>
@@ -285,629 +171,7 @@
           <w:color w:val="000000"/>
           <w:sz w:val="18"/>
         </w:rPr>
-        <w:t xml:space="preserve">Data Analyst Intern </w:t>
-      </w:r>
-      <w:r>
-        <w:rPr>
-          <w:rFonts w:ascii="Times New Roman" w:hAnsi="Times New Roman"/>
-          <w:i w:val="0"/>
-          <w:color w:val="000000"/>
-          <w:sz w:val="18"/>
-        </w:rPr>
-        <w:t>| Bluestock Fintech / Uptricks Services Pvt. Ltd. (Pune / Remote)</w:t>
-      </w:r>
-      <w:r>
-        <w:rPr>
-          <w:rFonts w:ascii="Times New Roman" w:hAnsi="Times New Roman"/>
-          <w:b/>
-          <w:i w:val="0"/>
-          <w:color w:val="000000"/>
-          <w:sz w:val="18"/>
-        </w:rPr>
-        <w:tab/>
-        <w:t>May 2026 – Nov 2026</w:t>
-      </w:r>
-    </w:p>
-    <w:p>
-      <w:pPr>
-        <w:spacing w:after="36" w:line="240" w:lineRule="auto" w:before="0"/>
-        <w:ind w:left="173"/>
-      </w:pPr>
-      <w:r/>
-      <w:r>
-        <w:rPr>
-          <w:rFonts w:ascii="Times New Roman" w:hAnsi="Times New Roman"/>
-          <w:b w:val="0"/>
-          <w:i w:val="0"/>
-          <w:color w:val="000000"/>
-          <w:sz w:val="17"/>
-        </w:rPr>
-        <w:t>• Analyzed multi-asset portfolio data using Python and SQL (Sharpe ratio, drawdown, volatility risk metrics); automated ETL pipelines and developed interactive Power BI KPI dashboards for fund performance.</w:t>
-      </w:r>
-    </w:p>
-    <w:p>
-      <w:pPr>
-        <w:spacing w:before="30" w:after="10" w:line="240" w:lineRule="auto"/>
-      </w:pPr>
-      <w:r>
-        <w:rPr>
-          <w:rFonts w:ascii="Times New Roman" w:hAnsi="Times New Roman"/>
-          <w:b/>
-          <w:i w:val="0"/>
-          <w:color w:val="000000"/>
-          <w:sz w:val="18"/>
-        </w:rPr>
-        <w:t xml:space="preserve">Data Analytics Summer Intern </w:t>
-      </w:r>
-      <w:r>
-        <w:rPr>
-          <w:rFonts w:ascii="Times New Roman" w:hAnsi="Times New Roman"/>
-          <w:i w:val="0"/>
-          <w:color w:val="000000"/>
-          <w:sz w:val="18"/>
-        </w:rPr>
-        <w:t>| Recimotech Solutions (Srinagar, J&amp;K)</w:t>
-      </w:r>
-      <w:r>
-        <w:rPr>
-          <w:rFonts w:ascii="Times New Roman" w:hAnsi="Times New Roman"/>
-          <w:b/>
-          <w:i w:val="0"/>
-          <w:color w:val="000000"/>
-          <w:sz w:val="18"/>
-        </w:rPr>
-        <w:tab/>
-        <w:t>Jun 2026 – Aug 2026</w:t>
-      </w:r>
-    </w:p>
-    <w:p>
-      <w:pPr>
-        <w:spacing w:after="36" w:line="240" w:lineRule="auto" w:before="0"/>
-        <w:ind w:left="173"/>
-      </w:pPr>
-      <w:r/>
-      <w:r>
-        <w:rPr>
-          <w:rFonts w:ascii="Times New Roman" w:hAnsi="Times New Roman"/>
-          <w:b w:val="0"/>
-          <w:i w:val="0"/>
-          <w:color w:val="000000"/>
-          <w:sz w:val="17"/>
-        </w:rPr>
-        <w:t>• Handled end-to-end ETL workflows, data cleaning, and relational SQL queries to engineer operational BI visualization dashboards, cutting reporting cycle time.</w:t>
-      </w:r>
-    </w:p>
-    <w:p>
-      <w:pPr>
-        <w:pBdr>
-          <w:bottom w:val="single" w:sz="6" w:space="1" w:color="000000"/>
-        </w:pBdr>
-        <w:spacing w:before="70" w:after="30" w:line="240" w:lineRule="auto"/>
-      </w:pPr>
-      <w:r>
-        <w:rPr>
-          <w:rFonts w:ascii="Times New Roman" w:hAnsi="Times New Roman"/>
-          <w:b/>
-          <w:i w:val="0"/>
-          <w:color w:val="000000"/>
-          <w:sz w:val="19"/>
-        </w:rPr>
-        <w:t>TECHNICAL PROJECTS</w:t>
-      </w:r>
-    </w:p>
-    <w:p>
-      <w:pPr>
-        <w:spacing w:before="30" w:after="0" w:line="240" w:lineRule="auto"/>
-      </w:pPr>
-      <w:r/>
-      <w:r>
-        <w:rPr>
-          <w:rFonts w:ascii="Times New Roman" w:hAnsi="Times New Roman"/>
-          <w:b/>
-          <w:i w:val="0"/>
-          <w:color w:val="000000"/>
-          <w:sz w:val="18"/>
-        </w:rPr>
-        <w:t xml:space="preserve">DataMind AI – Intelligent CSV/Excel Analytics Assistant </w:t>
-      </w:r>
-      <w:r>
-        <w:rPr>
-          <w:rFonts w:ascii="Times New Roman" w:hAnsi="Times New Roman"/>
-          <w:b w:val="0"/>
-          <w:i w:val="0"/>
-          <w:color w:val="000000"/>
-          <w:sz w:val="17"/>
-        </w:rPr>
-        <w:t xml:space="preserve">| Python, Pandas, Plotly, Streamlit, LLMs | </w:t>
-      </w:r>
-      <w:hyperlink r:id="rId9">
-        <w:r>
-          <w:rPr>
-            <w:color w:val="000000"/>
-            <w:u w:val="single"/>
-            <w:sz w:val="17"/>
-            <w:rFonts w:ascii="Times New Roman" w:hAnsi="Times New Roman"/>
-          </w:rPr>
-          <w:t>[Live Demo]</w:t>
-        </w:r>
-      </w:hyperlink>
-    </w:p>
-    <w:p>
-      <w:pPr>
-        <w:spacing w:after="20" w:line="240" w:lineRule="auto" w:before="0"/>
-        <w:ind w:left="173"/>
-      </w:pPr>
-      <w:r/>
-      <w:r>
-        <w:rPr>
-          <w:rFonts w:ascii="Times New Roman" w:hAnsi="Times New Roman"/>
-          <w:b w:val="0"/>
-          <w:i w:val="0"/>
-          <w:color w:val="000000"/>
-          <w:sz w:val="17"/>
-        </w:rPr>
-        <w:t>• Built an AI-driven tool converting natural language queries into verified Pandas code, interactive Plotly charts, and automated summaries.</w:t>
-      </w:r>
-    </w:p>
-    <w:p>
-      <w:pPr>
-        <w:spacing w:before="30" w:after="0" w:line="240" w:lineRule="auto"/>
-      </w:pPr>
-      <w:r/>
-      <w:r>
-        <w:rPr>
-          <w:rFonts w:ascii="Times New Roman" w:hAnsi="Times New Roman"/>
-          <w:b/>
-          <w:i w:val="0"/>
-          <w:color w:val="000000"/>
-          <w:sz w:val="18"/>
-        </w:rPr>
-        <w:t xml:space="preserve">MFAnalytica – Mutual Fund Analytics Platform </w:t>
-      </w:r>
-      <w:r>
-        <w:rPr>
-          <w:rFonts w:ascii="Times New Roman" w:hAnsi="Times New Roman"/>
-          <w:b w:val="0"/>
-          <w:i w:val="0"/>
-          <w:color w:val="000000"/>
-          <w:sz w:val="17"/>
-        </w:rPr>
-        <w:t xml:space="preserve">| Python, Meta Prophet, Monte Carlo, Gemini AI | </w:t>
-      </w:r>
-      <w:hyperlink r:id="rId20">
-        <w:r>
-          <w:rPr>
-            <w:color w:val="000000"/>
-            <w:u w:val="single"/>
-            <w:sz w:val="17"/>
-            <w:rFonts w:ascii="Times New Roman" w:hAnsi="Times New Roman"/>
-          </w:rPr>
-          <w:t>[Live Demo]</w:t>
-        </w:r>
-      </w:hyperlink>
-    </w:p>
-    <w:p>
-      <w:pPr>
-        <w:spacing w:after="20" w:line="240" w:lineRule="auto" w:before="0"/>
-        <w:ind w:left="173"/>
-      </w:pPr>
-      <w:r/>
-      <w:r>
-        <w:rPr>
-          <w:rFonts w:ascii="Times New Roman" w:hAnsi="Times New Roman"/>
-          <w:b w:val="0"/>
-          <w:i w:val="0"/>
-          <w:color w:val="000000"/>
-          <w:sz w:val="17"/>
-        </w:rPr>
-        <w:t>• Developed an intelligent fund platform featuring Meta Prophet time-series forecasting, 2,000-path Monte Carlo risk simulations, and a RAG-based Gemini AI assistant for automated portfolio recommendations.</w:t>
-      </w:r>
-    </w:p>
-    <w:p>
-      <w:pPr>
-        <w:spacing w:before="30" w:after="0" w:line="240" w:lineRule="auto"/>
-      </w:pPr>
-      <w:r/>
-      <w:r>
-        <w:rPr>
-          <w:rFonts w:ascii="Times New Roman" w:hAnsi="Times New Roman"/>
-          <w:b/>
-          <w:i w:val="0"/>
-          <w:color w:val="000000"/>
-          <w:sz w:val="18"/>
-        </w:rPr>
-        <w:t xml:space="preserve">Nifty100 Financial Intelligence Platform </w:t>
-      </w:r>
-      <w:r>
-        <w:rPr>
-          <w:rFonts w:ascii="Times New Roman" w:hAnsi="Times New Roman"/>
-          <w:b w:val="0"/>
-          <w:i w:val="0"/>
-          <w:color w:val="000000"/>
-          <w:sz w:val="17"/>
-        </w:rPr>
-        <w:t xml:space="preserve">| Python, Pandas, Streamlit, FastAPI, ML | </w:t>
-      </w:r>
-      <w:hyperlink r:id="rId20">
-        <w:r>
-          <w:rPr>
-            <w:color w:val="000000"/>
-            <w:u w:val="single"/>
-            <w:sz w:val="17"/>
-            <w:rFonts w:ascii="Times New Roman" w:hAnsi="Times New Roman"/>
-          </w:rPr>
-          <w:t>[Live Demo]</w:t>
-        </w:r>
-      </w:hyperlink>
-    </w:p>
-    <w:p>
-      <w:pPr>
-        <w:spacing w:after="20" w:line="240" w:lineRule="auto" w:before="0"/>
-        <w:ind w:left="173"/>
-      </w:pPr>
-      <w:r/>
-      <w:r>
-        <w:rPr>
-          <w:rFonts w:ascii="Times New Roman" w:hAnsi="Times New Roman"/>
-          <w:b w:val="0"/>
-          <w:i w:val="0"/>
-          <w:color w:val="000000"/>
-          <w:sz w:val="17"/>
-        </w:rPr>
-        <w:t>• Engineered an automated stock intelligence engine for 90+ Nifty 100 tickers using Isolation Forest, 3D-PCA anomaly detection, and Monte Carlo risk valuation.</w:t>
-      </w:r>
-    </w:p>
-    <w:p>
-      <w:pPr>
-        <w:spacing w:before="30" w:after="0" w:line="240" w:lineRule="auto"/>
-      </w:pPr>
-      <w:r/>
-      <w:r>
-        <w:rPr>
-          <w:rFonts w:ascii="Times New Roman" w:hAnsi="Times New Roman"/>
-          <w:b/>
-          <w:i w:val="0"/>
-          <w:color w:val="000000"/>
-          <w:sz w:val="18"/>
-        </w:rPr>
-        <w:t xml:space="preserve">Customer Churn Prediction &amp; Retention Analytics </w:t>
-      </w:r>
-      <w:r>
-        <w:rPr>
-          <w:rFonts w:ascii="Times New Roman" w:hAnsi="Times New Roman"/>
-          <w:b w:val="0"/>
-          <w:i w:val="0"/>
-          <w:color w:val="000000"/>
-          <w:sz w:val="17"/>
-        </w:rPr>
-        <w:t xml:space="preserve">| SQL, Python, XGBoost, Streamlit, Power BI | </w:t>
-      </w:r>
-      <w:hyperlink r:id="rId11">
-        <w:r>
-          <w:rPr>
-            <w:color w:val="000000"/>
-            <w:u w:val="single"/>
-            <w:sz w:val="17"/>
-            <w:rFonts w:ascii="Times New Roman" w:hAnsi="Times New Roman"/>
-          </w:rPr>
-          <w:t>[Live Demo]</w:t>
-        </w:r>
-      </w:hyperlink>
-    </w:p>
-    <w:p>
-      <w:pPr>
-        <w:spacing w:after="20" w:line="240" w:lineRule="auto" w:before="0"/>
-        <w:ind w:left="173"/>
-      </w:pPr>
-      <w:r/>
-      <w:r>
-        <w:rPr>
-          <w:rFonts w:ascii="Times New Roman" w:hAnsi="Times New Roman"/>
-          <w:b w:val="0"/>
-          <w:i w:val="0"/>
-          <w:color w:val="000000"/>
-          <w:sz w:val="17"/>
-        </w:rPr>
-        <w:t>• Identified churn risk across 7,000+ customers using an XGBoost classifier; deployed a live risk-tracking dashboard to protect vulnerable ARR.</w:t>
-      </w:r>
-    </w:p>
-    <w:p>
-      <w:pPr>
-        <w:spacing w:before="30" w:after="0" w:line="240" w:lineRule="auto"/>
-      </w:pPr>
-      <w:r/>
-      <w:r>
-        <w:rPr>
-          <w:rFonts w:ascii="Times New Roman" w:hAnsi="Times New Roman"/>
-          <w:b/>
-          <w:i w:val="0"/>
-          <w:color w:val="000000"/>
-          <w:sz w:val="18"/>
-        </w:rPr>
-        <w:t xml:space="preserve">Bengaluru Ola Ride Operations Analytics </w:t>
-      </w:r>
-      <w:r>
-        <w:rPr>
-          <w:rFonts w:ascii="Times New Roman" w:hAnsi="Times New Roman"/>
-          <w:b w:val="0"/>
-          <w:i w:val="0"/>
-          <w:color w:val="000000"/>
-          <w:sz w:val="17"/>
-        </w:rPr>
-        <w:t xml:space="preserve">| SQL, Python, Power BI, XGBoost | </w:t>
-      </w:r>
-      <w:hyperlink r:id="rId21">
-        <w:r>
-          <w:rPr>
-            <w:color w:val="000000"/>
-            <w:u w:val="single"/>
-            <w:sz w:val="17"/>
-            <w:rFonts w:ascii="Times New Roman" w:hAnsi="Times New Roman"/>
-          </w:rPr>
-          <w:t>[Live Demo]</w:t>
-        </w:r>
-      </w:hyperlink>
-    </w:p>
-    <w:p>
-      <w:pPr>
-        <w:spacing w:after="20" w:line="240" w:lineRule="auto" w:before="0"/>
-        <w:ind w:left="173"/>
-      </w:pPr>
-      <w:r/>
-      <w:r>
-        <w:rPr>
-          <w:rFonts w:ascii="Times New Roman" w:hAnsi="Times New Roman"/>
-          <w:b w:val="0"/>
-          <w:i w:val="0"/>
-          <w:color w:val="000000"/>
-          <w:sz w:val="17"/>
-        </w:rPr>
-        <w:t>• Analyzed 100K+ trip records to uncover peak-hour cancellation bottlenecks; built an operational Power BI dashboard and ML cancellation forecast.</w:t>
-      </w:r>
-    </w:p>
-    <w:p>
-      <w:pPr>
-        <w:spacing w:before="30" w:after="0" w:line="240" w:lineRule="auto"/>
-      </w:pPr>
-      <w:r/>
-      <w:r>
-        <w:rPr>
-          <w:rFonts w:ascii="Times New Roman" w:hAnsi="Times New Roman"/>
-          <w:b/>
-          <w:i w:val="0"/>
-          <w:color w:val="000000"/>
-          <w:sz w:val="18"/>
-        </w:rPr>
-        <w:t xml:space="preserve">Hospital Readmission Analysis System </w:t>
-      </w:r>
-      <w:r>
-        <w:rPr>
-          <w:rFonts w:ascii="Times New Roman" w:hAnsi="Times New Roman"/>
-          <w:b w:val="0"/>
-          <w:i w:val="0"/>
-          <w:color w:val="000000"/>
-          <w:sz w:val="17"/>
-        </w:rPr>
-        <w:t xml:space="preserve">| Python, Pandas, Seaborn, Streamlit | </w:t>
-      </w:r>
-      <w:hyperlink r:id="rId12">
-        <w:r>
-          <w:rPr>
-            <w:color w:val="000000"/>
-            <w:u w:val="single"/>
-            <w:sz w:val="17"/>
-            <w:rFonts w:ascii="Times New Roman" w:hAnsi="Times New Roman"/>
-          </w:rPr>
-          <w:t>[Live Demo]</w:t>
-        </w:r>
-      </w:hyperlink>
-    </w:p>
-    <w:p>
-      <w:pPr>
-        <w:spacing w:after="20" w:line="240" w:lineRule="auto" w:before="0"/>
-        <w:ind w:left="173"/>
-      </w:pPr>
-      <w:r/>
-      <w:r>
-        <w:rPr>
-          <w:rFonts w:ascii="Times New Roman" w:hAnsi="Times New Roman"/>
-          <w:b w:val="0"/>
-          <w:i w:val="0"/>
-          <w:color w:val="000000"/>
-          <w:sz w:val="17"/>
-        </w:rPr>
-        <w:t>• Modeled clinical indicators across 15,000+ patient records to isolate key readmission drivers and deployed an interactive risk screening tool.</w:t>
-      </w:r>
-    </w:p>
-    <w:p>
-      <w:pPr>
-        <w:spacing w:before="30" w:after="0" w:line="240" w:lineRule="auto"/>
-      </w:pPr>
-      <w:r/>
-      <w:r>
-        <w:rPr>
-          <w:rFonts w:ascii="Times New Roman" w:hAnsi="Times New Roman"/>
-          <w:b/>
-          <w:i w:val="0"/>
-          <w:color w:val="000000"/>
-          <w:sz w:val="18"/>
-        </w:rPr>
-        <w:t xml:space="preserve">F1 Strategy &amp; Telemetry Analytics Dashboard </w:t>
-      </w:r>
-      <w:r>
-        <w:rPr>
-          <w:rFonts w:ascii="Times New Roman" w:hAnsi="Times New Roman"/>
-          <w:b w:val="0"/>
-          <w:i w:val="0"/>
-          <w:color w:val="000000"/>
-          <w:sz w:val="17"/>
-        </w:rPr>
-        <w:t xml:space="preserve">| Python, Plotly, FastF1, Streamlit | </w:t>
-      </w:r>
-      <w:hyperlink r:id="rId22">
-        <w:r>
-          <w:rPr>
-            <w:color w:val="000000"/>
-            <w:u w:val="single"/>
-            <w:sz w:val="17"/>
-            <w:rFonts w:ascii="Times New Roman" w:hAnsi="Times New Roman"/>
-          </w:rPr>
-          <w:t>[Live Demo]</w:t>
-        </w:r>
-      </w:hyperlink>
-    </w:p>
-    <w:p>
-      <w:pPr>
-        <w:spacing w:after="20" w:line="240" w:lineRule="auto" w:before="0"/>
-        <w:ind w:left="173"/>
-      </w:pPr>
-      <w:r/>
-      <w:r>
-        <w:rPr>
-          <w:rFonts w:ascii="Times New Roman" w:hAnsi="Times New Roman"/>
-          <w:b w:val="0"/>
-          <w:i w:val="0"/>
-          <w:color w:val="000000"/>
-          <w:sz w:val="17"/>
-        </w:rPr>
-        <w:t>• Visualized micro-sector speed telemetry, tyre degradation dynamics, and circuit grip evolution across Grand Prix sessions.</w:t>
-      </w:r>
-    </w:p>
-    <w:p>
-      <w:pPr>
-        <w:spacing w:before="30" w:after="0" w:line="240" w:lineRule="auto"/>
-      </w:pPr>
-      <w:r/>
-      <w:r>
-        <w:rPr>
-          <w:rFonts w:ascii="Times New Roman" w:hAnsi="Times New Roman"/>
-          <w:b/>
-          <w:i w:val="0"/>
-          <w:color w:val="000000"/>
-          <w:sz w:val="18"/>
-        </w:rPr>
-        <w:t xml:space="preserve">FarmSight – Crop Price &amp; Weather Correlation Analysis </w:t>
-      </w:r>
-      <w:r>
-        <w:rPr>
-          <w:rFonts w:ascii="Times New Roman" w:hAnsi="Times New Roman"/>
-          <w:b w:val="0"/>
-          <w:i w:val="0"/>
-          <w:color w:val="000000"/>
-          <w:sz w:val="17"/>
-        </w:rPr>
-        <w:t xml:space="preserve">| Python, Streamlit, Excel, Power BI | </w:t>
-      </w:r>
-      <w:hyperlink r:id="rId14">
-        <w:r>
-          <w:rPr>
-            <w:color w:val="000000"/>
-            <w:u w:val="single"/>
-            <w:sz w:val="17"/>
-            <w:rFonts w:ascii="Times New Roman" w:hAnsi="Times New Roman"/>
-          </w:rPr>
-          <w:t>[Live Demo]</w:t>
-        </w:r>
-      </w:hyperlink>
-    </w:p>
-    <w:p>
-      <w:pPr>
-        <w:spacing w:before="0" w:after="20" w:line="240" w:lineRule="auto"/>
-      </w:pPr>
-      <w:r/>
-      <w:r>
-        <w:rPr>
-          <w:rFonts w:ascii="Times New Roman" w:hAnsi="Times New Roman"/>
-          <w:b w:val="0"/>
-          <w:i w:val="0"/>
-          <w:color w:val="000000"/>
-          <w:sz w:val="17"/>
-        </w:rPr>
-        <w:t>• Correlated historical mandi crop spot prices with precipitation patterns to model price elasticity and seasonality trends.</w:t>
-      </w:r>
-    </w:p>
-    <w:p>
-      <w:pPr>
-        <w:pBdr>
-          <w:bottom w:val="single" w:sz="6" w:space="1" w:color="000000"/>
-        </w:pBdr>
-        <w:spacing w:before="70" w:after="30" w:line="240" w:lineRule="auto"/>
-      </w:pPr>
-      <w:r>
-        <w:rPr>
-          <w:rFonts w:ascii="Times New Roman" w:hAnsi="Times New Roman"/>
-          <w:b/>
-          <w:i w:val="0"/>
-          <w:color w:val="000000"/>
-          <w:sz w:val="19"/>
-        </w:rPr>
-        <w:t>EDUCATION</w:t>
-      </w:r>
-    </w:p>
-    <w:p>
-      <w:pPr>
-        <w:spacing w:before="30" w:after="24" w:line="240" w:lineRule="auto"/>
-      </w:pPr>
-      <w:r/>
-      <w:r>
-        <w:rPr>
-          <w:rFonts w:ascii="Times New Roman" w:hAnsi="Times New Roman"/>
-          <w:b/>
-          <w:i w:val="0"/>
-          <w:color w:val="000000"/>
-          <w:sz w:val="18"/>
-        </w:rPr>
-        <w:t xml:space="preserve">B.Tech in Computer Science &amp; Engineering (AI &amp; ML) </w:t>
-      </w:r>
-      <w:r>
-        <w:rPr>
-          <w:rFonts w:ascii="Times New Roman" w:hAnsi="Times New Roman"/>
-          <w:b w:val="0"/>
-          <w:i w:val="0"/>
-          <w:color w:val="000000"/>
-          <w:sz w:val="18"/>
-        </w:rPr>
-        <w:t>— GNA University, Punjab</w:t>
-      </w:r>
-      <w:r>
-        <w:rPr>
-          <w:rFonts w:ascii="Times New Roman" w:hAnsi="Times New Roman"/>
-          <w:b/>
-          <w:i w:val="0"/>
-          <w:color w:val="000000"/>
-          <w:sz w:val="18"/>
-        </w:rPr>
-        <w:tab/>
-        <w:t>2023 – 2027</w:t>
-        <w:br/>
-      </w:r>
-      <w:r>
-        <w:rPr>
-          <w:rFonts w:ascii="Times New Roman" w:hAnsi="Times New Roman"/>
-          <w:b w:val="0"/>
-          <w:i w:val="0"/>
-          <w:color w:val="000000"/>
-          <w:sz w:val="17"/>
-        </w:rPr>
-        <w:t>Relevant Coursework: Data Warehousing &amp; Data Mining, Machine Learning, DBMS (SQL), Data Analytics, Data Structures &amp; Algorithms, Statistics &amp; Probability</w:t>
-      </w:r>
-    </w:p>
-    <w:p>
-      <w:pPr>
-        <w:pBdr>
-          <w:bottom w:val="single" w:sz="6" w:space="1" w:color="000000"/>
-        </w:pBdr>
-        <w:spacing w:before="70" w:after="30" w:line="240" w:lineRule="auto"/>
-      </w:pPr>
-      <w:r>
-        <w:rPr>
-          <w:rFonts w:ascii="Times New Roman" w:hAnsi="Times New Roman"/>
-          <w:b/>
-          <w:i w:val="0"/>
-          <w:color w:val="000000"/>
-          <w:sz w:val="19"/>
-        </w:rPr>
-        <w:t>CERTIFICATIONS &amp; TRAINING</w:t>
+        <w:t>TECHNICAL SKILLS</w:t>
       </w:r>
     </w:p>
     <w:p>
@@ -922,7 +186,845 @@
           <w:b/>
           <w:i w:val="0"/>
           <w:color w:val="000000"/>
+          <w:sz w:val="17"/>
+        </w:rPr>
+        <w:t xml:space="preserve">• Querying &amp; Analysis: </w:t>
+      </w:r>
+      <w:r>
+        <w:rPr>
+          <w:rFonts w:ascii="Times New Roman" w:hAnsi="Times New Roman"/>
+          <w:b w:val="0"/>
+          <w:i w:val="0"/>
+          <w:color w:val="000000"/>
+          <w:sz w:val="17"/>
+        </w:rPr>
+        <w:t>SQL (MySQL, PostgreSQL: CTEs, Window Functions, Joins), Python (Pandas, NumPy), Advanced Excel (Power Query, DAX, Pivot Tables), ETL Pipelines</w:t>
+      </w:r>
+    </w:p>
+    <w:p>
+      <w:pPr>
+        <w:spacing w:after="16" w:line="240" w:lineRule="auto" w:before="0"/>
+        <w:ind w:left="173"/>
+      </w:pPr>
+      <w:r/>
+      <w:r>
+        <w:rPr>
+          <w:rFonts w:ascii="Times New Roman" w:hAnsi="Times New Roman"/>
+          <w:b/>
+          <w:i w:val="0"/>
+          <w:color w:val="000000"/>
+          <w:sz w:val="17"/>
+        </w:rPr>
+        <w:t xml:space="preserve">• BI &amp; Visualization: </w:t>
+      </w:r>
+      <w:r>
+        <w:rPr>
+          <w:rFonts w:ascii="Times New Roman" w:hAnsi="Times New Roman"/>
+          <w:b w:val="0"/>
+          <w:i w:val="0"/>
+          <w:color w:val="000000"/>
+          <w:sz w:val="17"/>
+        </w:rPr>
+        <w:t>Power BI (Data Modeling, DAX Measures), Microsoft Fabric, Streamlit, Plotly, Interactive KPI Dashboards, Matplotlib, Seaborn</w:t>
+      </w:r>
+    </w:p>
+    <w:p>
+      <w:pPr>
+        <w:spacing w:after="16" w:line="240" w:lineRule="auto" w:before="0"/>
+        <w:ind w:left="173"/>
+      </w:pPr>
+      <w:r/>
+      <w:r>
+        <w:rPr>
+          <w:rFonts w:ascii="Times New Roman" w:hAnsi="Times New Roman"/>
+          <w:b/>
+          <w:i w:val="0"/>
+          <w:color w:val="000000"/>
+          <w:sz w:val="17"/>
+        </w:rPr>
+        <w:t xml:space="preserve">• Machine Learning &amp; AI: </w:t>
+      </w:r>
+      <w:r>
+        <w:rPr>
+          <w:rFonts w:ascii="Times New Roman" w:hAnsi="Times New Roman"/>
+          <w:b w:val="0"/>
+          <w:i w:val="0"/>
+          <w:color w:val="000000"/>
+          <w:sz w:val="17"/>
+        </w:rPr>
+        <w:t>Scikit-learn, XGBoost, Meta Prophet, Monte Carlo Simulation, LLMs &amp; RAG (Gemini AI), FastF1, Anomaly Detection (Isolation Forest, PCA), Git</w:t>
+      </w:r>
+    </w:p>
+    <w:p>
+      <w:pPr>
+        <w:pBdr>
+          <w:bottom w:val="single" w:sz="6" w:space="1" w:color="000000"/>
+        </w:pBdr>
+        <w:spacing w:before="60" w:after="20" w:line="240" w:lineRule="auto"/>
+      </w:pPr>
+      <w:r>
+        <w:rPr>
+          <w:rFonts w:ascii="Times New Roman" w:hAnsi="Times New Roman"/>
+          <w:b/>
+          <w:i w:val="0"/>
+          <w:color w:val="000000"/>
           <w:sz w:val="18"/>
+        </w:rPr>
+        <w:t>PROFESSIONAL EXPERIENCE</w:t>
+      </w:r>
+    </w:p>
+    <w:p>
+      <w:pPr>
+        <w:spacing w:before="24" w:after="6" w:line="240" w:lineRule="auto"/>
+      </w:pPr>
+      <w:r>
+        <w:rPr>
+          <w:rFonts w:ascii="Times New Roman" w:hAnsi="Times New Roman"/>
+          <w:b/>
+          <w:i w:val="0"/>
+          <w:color w:val="000000"/>
+          <w:sz w:val="17"/>
+        </w:rPr>
+        <w:t xml:space="preserve">Data Analyst Intern </w:t>
+      </w:r>
+      <w:r>
+        <w:rPr>
+          <w:rFonts w:ascii="Times New Roman" w:hAnsi="Times New Roman"/>
+          <w:i w:val="0"/>
+          <w:color w:val="000000"/>
+          <w:sz w:val="17"/>
+        </w:rPr>
+        <w:t>| Bluestock Fintech / Uptricks Services Pvt. Ltd. (Pune / Remote)</w:t>
+      </w:r>
+      <w:r>
+        <w:rPr>
+          <w:rFonts w:ascii="Times New Roman" w:hAnsi="Times New Roman"/>
+          <w:b/>
+          <w:i w:val="0"/>
+          <w:color w:val="000000"/>
+          <w:sz w:val="17"/>
+        </w:rPr>
+        <w:tab/>
+        <w:t>May 2026 – Nov 2026</w:t>
+      </w:r>
+    </w:p>
+    <w:p>
+      <w:pPr>
+        <w:spacing w:after="30" w:line="240" w:lineRule="auto" w:before="0"/>
+        <w:ind w:left="173"/>
+      </w:pPr>
+      <w:r/>
+      <w:r>
+        <w:rPr>
+          <w:rFonts w:ascii="Times New Roman" w:hAnsi="Times New Roman"/>
+          <w:b w:val="0"/>
+          <w:i w:val="0"/>
+          <w:color w:val="000000"/>
+          <w:sz w:val="16"/>
+        </w:rPr>
+        <w:t>• Analyzed multi-asset portfolio data using Python and SQL (Sharpe ratio, drawdown, volatility risk metrics); automated ETL pipelines and developed interactive Power BI KPI dashboards for fund performance.</w:t>
+      </w:r>
+    </w:p>
+    <w:p>
+      <w:pPr>
+        <w:spacing w:before="24" w:after="6" w:line="240" w:lineRule="auto"/>
+      </w:pPr>
+      <w:r>
+        <w:rPr>
+          <w:rFonts w:ascii="Times New Roman" w:hAnsi="Times New Roman"/>
+          <w:b/>
+          <w:i w:val="0"/>
+          <w:color w:val="000000"/>
+          <w:sz w:val="17"/>
+        </w:rPr>
+        <w:t xml:space="preserve">Data Analytics Summer Intern </w:t>
+      </w:r>
+      <w:r>
+        <w:rPr>
+          <w:rFonts w:ascii="Times New Roman" w:hAnsi="Times New Roman"/>
+          <w:i w:val="0"/>
+          <w:color w:val="000000"/>
+          <w:sz w:val="17"/>
+        </w:rPr>
+        <w:t>| Recimotech Solutions (Srinagar, J&amp;K)</w:t>
+      </w:r>
+      <w:r>
+        <w:rPr>
+          <w:rFonts w:ascii="Times New Roman" w:hAnsi="Times New Roman"/>
+          <w:b/>
+          <w:i w:val="0"/>
+          <w:color w:val="000000"/>
+          <w:sz w:val="17"/>
+        </w:rPr>
+        <w:tab/>
+        <w:t>Jun 2026 – Aug 2026</w:t>
+      </w:r>
+    </w:p>
+    <w:p>
+      <w:pPr>
+        <w:spacing w:after="30" w:line="240" w:lineRule="auto" w:before="0"/>
+        <w:ind w:left="173"/>
+      </w:pPr>
+      <w:r/>
+      <w:r>
+        <w:rPr>
+          <w:rFonts w:ascii="Times New Roman" w:hAnsi="Times New Roman"/>
+          <w:b w:val="0"/>
+          <w:i w:val="0"/>
+          <w:color w:val="000000"/>
+          <w:sz w:val="16"/>
+        </w:rPr>
+        <w:t>• Handled end-to-end ETL workflows, data cleaning, and relational SQL queries to engineer operational BI visualization dashboards, cutting reporting cycle time.</w:t>
+      </w:r>
+    </w:p>
+    <w:p>
+      <w:pPr>
+        <w:pBdr>
+          <w:bottom w:val="single" w:sz="6" w:space="1" w:color="000000"/>
+        </w:pBdr>
+        <w:spacing w:before="60" w:after="20" w:line="240" w:lineRule="auto"/>
+      </w:pPr>
+      <w:r>
+        <w:rPr>
+          <w:rFonts w:ascii="Times New Roman" w:hAnsi="Times New Roman"/>
+          <w:b/>
+          <w:i w:val="0"/>
+          <w:color w:val="000000"/>
+          <w:sz w:val="18"/>
+        </w:rPr>
+        <w:t>TECHNICAL PROJECTS</w:t>
+      </w:r>
+    </w:p>
+    <w:p>
+      <w:pPr>
+        <w:spacing w:before="24" w:after="0" w:line="240" w:lineRule="auto"/>
+      </w:pPr>
+      <w:r/>
+      <w:r>
+        <w:rPr>
+          <w:rFonts w:ascii="Times New Roman" w:hAnsi="Times New Roman"/>
+          <w:b/>
+          <w:i w:val="0"/>
+          <w:color w:val="000000"/>
+          <w:sz w:val="17"/>
+        </w:rPr>
+        <w:t xml:space="preserve">DataMind AI – Intelligent CSV/Excel Analytics Assistant </w:t>
+      </w:r>
+      <w:r>
+        <w:rPr>
+          <w:rFonts w:ascii="Times New Roman" w:hAnsi="Times New Roman"/>
+          <w:b w:val="0"/>
+          <w:i w:val="0"/>
+          <w:color w:val="000000"/>
+          <w:sz w:val="16"/>
+        </w:rPr>
+        <w:t xml:space="preserve">| Python, Pandas, Plotly, Streamlit, LLMs | </w:t>
+      </w:r>
+      <w:hyperlink r:id="rId9">
+        <w:r>
+          <w:rPr>
+            <w:color w:val="000000"/>
+            <w:u w:val="single"/>
+            <w:sz w:val="16"/>
+            <w:rFonts w:ascii="Times New Roman" w:hAnsi="Times New Roman"/>
+          </w:rPr>
+          <w:t>[Live Demo]</w:t>
+        </w:r>
+      </w:hyperlink>
+    </w:p>
+    <w:p>
+      <w:pPr>
+        <w:spacing w:after="16" w:line="240" w:lineRule="auto" w:before="0"/>
+        <w:ind w:left="173"/>
+      </w:pPr>
+      <w:r/>
+      <w:r>
+        <w:rPr>
+          <w:rFonts w:ascii="Times New Roman" w:hAnsi="Times New Roman"/>
+          <w:b w:val="0"/>
+          <w:i w:val="0"/>
+          <w:color w:val="000000"/>
+          <w:sz w:val="16"/>
+        </w:rPr>
+        <w:t>• Built an AI-driven tool converting natural language queries into verified Pandas code, interactive Plotly charts, and automated summaries.</w:t>
+      </w:r>
+    </w:p>
+    <w:p>
+      <w:pPr>
+        <w:spacing w:before="24" w:after="0" w:line="240" w:lineRule="auto"/>
+      </w:pPr>
+      <w:r/>
+      <w:r>
+        <w:rPr>
+          <w:rFonts w:ascii="Times New Roman" w:hAnsi="Times New Roman"/>
+          <w:b/>
+          <w:i w:val="0"/>
+          <w:color w:val="000000"/>
+          <w:sz w:val="17"/>
+        </w:rPr>
+        <w:t xml:space="preserve">MFAnalytica – Mutual Fund Analytics Platform </w:t>
+      </w:r>
+      <w:r>
+        <w:rPr>
+          <w:rFonts w:ascii="Times New Roman" w:hAnsi="Times New Roman"/>
+          <w:b w:val="0"/>
+          <w:i w:val="0"/>
+          <w:color w:val="000000"/>
+          <w:sz w:val="16"/>
+        </w:rPr>
+        <w:t xml:space="preserve">| Python, Meta Prophet, Monte Carlo, Gemini AI | </w:t>
+      </w:r>
+      <w:hyperlink r:id="rId20">
+        <w:r>
+          <w:rPr>
+            <w:color w:val="000000"/>
+            <w:u w:val="single"/>
+            <w:sz w:val="16"/>
+            <w:rFonts w:ascii="Times New Roman" w:hAnsi="Times New Roman"/>
+          </w:rPr>
+          <w:t>[Live Demo]</w:t>
+        </w:r>
+      </w:hyperlink>
+    </w:p>
+    <w:p>
+      <w:pPr>
+        <w:spacing w:after="16" w:line="240" w:lineRule="auto" w:before="0"/>
+        <w:ind w:left="173"/>
+      </w:pPr>
+      <w:r/>
+      <w:r>
+        <w:rPr>
+          <w:rFonts w:ascii="Times New Roman" w:hAnsi="Times New Roman"/>
+          <w:b w:val="0"/>
+          <w:i w:val="0"/>
+          <w:color w:val="000000"/>
+          <w:sz w:val="16"/>
+        </w:rPr>
+        <w:t>• Developed an intelligent fund platform featuring Meta Prophet time-series forecasting, 2,000-path Monte Carlo risk simulations, and a RAG-based Gemini AI assistant for automated portfolio recommendations.</w:t>
+      </w:r>
+    </w:p>
+    <w:p>
+      <w:pPr>
+        <w:spacing w:before="24" w:after="0" w:line="240" w:lineRule="auto"/>
+      </w:pPr>
+      <w:r/>
+      <w:r>
+        <w:rPr>
+          <w:rFonts w:ascii="Times New Roman" w:hAnsi="Times New Roman"/>
+          <w:b/>
+          <w:i w:val="0"/>
+          <w:color w:val="000000"/>
+          <w:sz w:val="17"/>
+        </w:rPr>
+        <w:t xml:space="preserve">Nifty100 Financial Intelligence Platform </w:t>
+      </w:r>
+      <w:r>
+        <w:rPr>
+          <w:rFonts w:ascii="Times New Roman" w:hAnsi="Times New Roman"/>
+          <w:b w:val="0"/>
+          <w:i w:val="0"/>
+          <w:color w:val="000000"/>
+          <w:sz w:val="16"/>
+        </w:rPr>
+        <w:t xml:space="preserve">| Python, Pandas, Streamlit, FastAPI, ML | </w:t>
+      </w:r>
+      <w:hyperlink r:id="rId20">
+        <w:r>
+          <w:rPr>
+            <w:color w:val="000000"/>
+            <w:u w:val="single"/>
+            <w:sz w:val="16"/>
+            <w:rFonts w:ascii="Times New Roman" w:hAnsi="Times New Roman"/>
+          </w:rPr>
+          <w:t>[Live Demo]</w:t>
+        </w:r>
+      </w:hyperlink>
+    </w:p>
+    <w:p>
+      <w:pPr>
+        <w:spacing w:after="16" w:line="240" w:lineRule="auto" w:before="0"/>
+        <w:ind w:left="173"/>
+      </w:pPr>
+      <w:r/>
+      <w:r>
+        <w:rPr>
+          <w:rFonts w:ascii="Times New Roman" w:hAnsi="Times New Roman"/>
+          <w:b w:val="0"/>
+          <w:i w:val="0"/>
+          <w:color w:val="000000"/>
+          <w:sz w:val="16"/>
+        </w:rPr>
+        <w:t>• Engineered an automated stock intelligence engine for 90+ Nifty 100 tickers using Isolation Forest, 3D-PCA anomaly detection, and Monte Carlo risk valuation.</w:t>
+      </w:r>
+    </w:p>
+    <w:p>
+      <w:pPr>
+        <w:spacing w:before="24" w:after="0" w:line="240" w:lineRule="auto"/>
+      </w:pPr>
+      <w:r/>
+      <w:r>
+        <w:rPr>
+          <w:rFonts w:ascii="Times New Roman" w:hAnsi="Times New Roman"/>
+          <w:b/>
+          <w:i w:val="0"/>
+          <w:color w:val="000000"/>
+          <w:sz w:val="17"/>
+        </w:rPr>
+        <w:t xml:space="preserve">Customer Churn Prediction &amp; Retention Analytics </w:t>
+      </w:r>
+      <w:r>
+        <w:rPr>
+          <w:rFonts w:ascii="Times New Roman" w:hAnsi="Times New Roman"/>
+          <w:b w:val="0"/>
+          <w:i w:val="0"/>
+          <w:color w:val="000000"/>
+          <w:sz w:val="16"/>
+        </w:rPr>
+        <w:t xml:space="preserve">| SQL, Python, XGBoost, Streamlit, Power BI | </w:t>
+      </w:r>
+      <w:hyperlink r:id="rId11">
+        <w:r>
+          <w:rPr>
+            <w:color w:val="000000"/>
+            <w:u w:val="single"/>
+            <w:sz w:val="16"/>
+            <w:rFonts w:ascii="Times New Roman" w:hAnsi="Times New Roman"/>
+          </w:rPr>
+          <w:t>[Live Demo]</w:t>
+        </w:r>
+      </w:hyperlink>
+    </w:p>
+    <w:p>
+      <w:pPr>
+        <w:spacing w:after="16" w:line="240" w:lineRule="auto" w:before="0"/>
+        <w:ind w:left="173"/>
+      </w:pPr>
+      <w:r/>
+      <w:r>
+        <w:rPr>
+          <w:rFonts w:ascii="Times New Roman" w:hAnsi="Times New Roman"/>
+          <w:b w:val="0"/>
+          <w:i w:val="0"/>
+          <w:color w:val="000000"/>
+          <w:sz w:val="16"/>
+        </w:rPr>
+        <w:t>• Identified churn risk across 7,000+ customers using an XGBoost classifier; deployed a live risk-tracking dashboard to protect vulnerable ARR.</w:t>
+      </w:r>
+    </w:p>
+    <w:p>
+      <w:pPr>
+        <w:spacing w:before="24" w:after="0" w:line="240" w:lineRule="auto"/>
+      </w:pPr>
+      <w:r/>
+      <w:r>
+        <w:rPr>
+          <w:rFonts w:ascii="Times New Roman" w:hAnsi="Times New Roman"/>
+          <w:b/>
+          <w:i w:val="0"/>
+          <w:color w:val="000000"/>
+          <w:sz w:val="17"/>
+        </w:rPr>
+        <w:t xml:space="preserve">Bengaluru Ola Ride Operations Analytics </w:t>
+      </w:r>
+      <w:r>
+        <w:rPr>
+          <w:rFonts w:ascii="Times New Roman" w:hAnsi="Times New Roman"/>
+          <w:b w:val="0"/>
+          <w:i w:val="0"/>
+          <w:color w:val="000000"/>
+          <w:sz w:val="16"/>
+        </w:rPr>
+        <w:t xml:space="preserve">| SQL, Python, Power BI, XGBoost | </w:t>
+      </w:r>
+      <w:hyperlink r:id="rId21">
+        <w:r>
+          <w:rPr>
+            <w:color w:val="000000"/>
+            <w:u w:val="single"/>
+            <w:sz w:val="16"/>
+            <w:rFonts w:ascii="Times New Roman" w:hAnsi="Times New Roman"/>
+          </w:rPr>
+          <w:t>[Live Demo]</w:t>
+        </w:r>
+      </w:hyperlink>
+    </w:p>
+    <w:p>
+      <w:pPr>
+        <w:spacing w:after="16" w:line="240" w:lineRule="auto" w:before="0"/>
+        <w:ind w:left="173"/>
+      </w:pPr>
+      <w:r/>
+      <w:r>
+        <w:rPr>
+          <w:rFonts w:ascii="Times New Roman" w:hAnsi="Times New Roman"/>
+          <w:b w:val="0"/>
+          <w:i w:val="0"/>
+          <w:color w:val="000000"/>
+          <w:sz w:val="16"/>
+        </w:rPr>
+        <w:t>• Analyzed 100K+ trip records to uncover peak-hour cancellation bottlenecks; built an operational Power BI dashboard and ML cancellation forecast.</w:t>
+      </w:r>
+    </w:p>
+    <w:p>
+      <w:pPr>
+        <w:spacing w:before="24" w:after="0" w:line="240" w:lineRule="auto"/>
+      </w:pPr>
+      <w:r/>
+      <w:r>
+        <w:rPr>
+          <w:rFonts w:ascii="Times New Roman" w:hAnsi="Times New Roman"/>
+          <w:b/>
+          <w:i w:val="0"/>
+          <w:color w:val="000000"/>
+          <w:sz w:val="17"/>
+        </w:rPr>
+        <w:t xml:space="preserve">Hospital Readmission Analysis System </w:t>
+      </w:r>
+      <w:r>
+        <w:rPr>
+          <w:rFonts w:ascii="Times New Roman" w:hAnsi="Times New Roman"/>
+          <w:b w:val="0"/>
+          <w:i w:val="0"/>
+          <w:color w:val="000000"/>
+          <w:sz w:val="16"/>
+        </w:rPr>
+        <w:t xml:space="preserve">| Python, Pandas, Seaborn, Streamlit | </w:t>
+      </w:r>
+      <w:hyperlink r:id="rId12">
+        <w:r>
+          <w:rPr>
+            <w:color w:val="000000"/>
+            <w:u w:val="single"/>
+            <w:sz w:val="16"/>
+            <w:rFonts w:ascii="Times New Roman" w:hAnsi="Times New Roman"/>
+          </w:rPr>
+          <w:t>[Live Demo]</w:t>
+        </w:r>
+      </w:hyperlink>
+    </w:p>
+    <w:p>
+      <w:pPr>
+        <w:spacing w:after="16" w:line="240" w:lineRule="auto" w:before="0"/>
+        <w:ind w:left="173"/>
+      </w:pPr>
+      <w:r/>
+      <w:r>
+        <w:rPr>
+          <w:rFonts w:ascii="Times New Roman" w:hAnsi="Times New Roman"/>
+          <w:b w:val="0"/>
+          <w:i w:val="0"/>
+          <w:color w:val="000000"/>
+          <w:sz w:val="16"/>
+        </w:rPr>
+        <w:t>• Modeled clinical indicators across 15,000+ patient records to isolate key readmission drivers and deployed an interactive risk screening tool.</w:t>
+      </w:r>
+    </w:p>
+    <w:p>
+      <w:pPr>
+        <w:spacing w:before="24" w:after="0" w:line="240" w:lineRule="auto"/>
+      </w:pPr>
+      <w:r/>
+      <w:r>
+        <w:rPr>
+          <w:rFonts w:ascii="Times New Roman" w:hAnsi="Times New Roman"/>
+          <w:b/>
+          <w:i w:val="0"/>
+          <w:color w:val="000000"/>
+          <w:sz w:val="17"/>
+        </w:rPr>
+        <w:t xml:space="preserve">Sahaara AI – Empathetic Emotional Wellness Companion </w:t>
+      </w:r>
+      <w:r>
+        <w:rPr>
+          <w:rFonts w:ascii="Times New Roman" w:hAnsi="Times New Roman"/>
+          <w:b w:val="0"/>
+          <w:i w:val="0"/>
+          <w:color w:val="000000"/>
+          <w:sz w:val="16"/>
+        </w:rPr>
+        <w:t xml:space="preserve">| Python, Gemini API, Streamlit, NLP, gTTS | </w:t>
+      </w:r>
+      <w:hyperlink r:id="rId23">
+        <w:r>
+          <w:rPr>
+            <w:color w:val="000000"/>
+            <w:u w:val="single"/>
+            <w:sz w:val="16"/>
+            <w:rFonts w:ascii="Times New Roman" w:hAnsi="Times New Roman"/>
+          </w:rPr>
+          <w:t>[Live Demo]</w:t>
+        </w:r>
+      </w:hyperlink>
+    </w:p>
+    <w:p>
+      <w:pPr>
+        <w:spacing w:after="16" w:line="240" w:lineRule="auto" w:before="0"/>
+        <w:ind w:left="173"/>
+      </w:pPr>
+      <w:r/>
+      <w:r>
+        <w:rPr>
+          <w:rFonts w:ascii="Times New Roman" w:hAnsi="Times New Roman"/>
+          <w:b w:val="0"/>
+          <w:i w:val="0"/>
+          <w:color w:val="000000"/>
+          <w:sz w:val="16"/>
+        </w:rPr>
+        <w:t>• Developed an empathetic AI wellness companion featuring voice messaging, multilingual NLP, sentiment tracking, and safety guardrails.</w:t>
+      </w:r>
+    </w:p>
+    <w:p>
+      <w:pPr>
+        <w:spacing w:before="24" w:after="0" w:line="240" w:lineRule="auto"/>
+      </w:pPr>
+      <w:r/>
+      <w:r>
+        <w:rPr>
+          <w:rFonts w:ascii="Times New Roman" w:hAnsi="Times New Roman"/>
+          <w:b/>
+          <w:i w:val="0"/>
+          <w:color w:val="000000"/>
+          <w:sz w:val="17"/>
+        </w:rPr>
+        <w:t xml:space="preserve">GyaanBuddy – Multimodal AI STEM Learning Platform </w:t>
+      </w:r>
+      <w:r>
+        <w:rPr>
+          <w:rFonts w:ascii="Times New Roman" w:hAnsi="Times New Roman"/>
+          <w:b w:val="0"/>
+          <w:i w:val="0"/>
+          <w:color w:val="000000"/>
+          <w:sz w:val="16"/>
+        </w:rPr>
+        <w:t xml:space="preserve">| Python, Gemini Vision, Streamlit, Pytest | </w:t>
+      </w:r>
+      <w:hyperlink r:id="rId24">
+        <w:r>
+          <w:rPr>
+            <w:color w:val="000000"/>
+            <w:u w:val="single"/>
+            <w:sz w:val="16"/>
+            <w:rFonts w:ascii="Times New Roman" w:hAnsi="Times New Roman"/>
+          </w:rPr>
+          <w:t>[Live Demo]</w:t>
+        </w:r>
+      </w:hyperlink>
+    </w:p>
+    <w:p>
+      <w:pPr>
+        <w:spacing w:before="0" w:after="16" w:line="240" w:lineRule="auto"/>
+      </w:pPr>
+      <w:r/>
+      <w:r>
+        <w:rPr>
+          <w:rFonts w:ascii="Times New Roman" w:hAnsi="Times New Roman"/>
+          <w:b w:val="0"/>
+          <w:i w:val="0"/>
+          <w:color w:val="000000"/>
+          <w:sz w:val="16"/>
+        </w:rPr>
+        <w:t>• Built an interactive bilingual tutor with Snap &amp; Solve multimodal vision problem solving, 7 interactive STEM labs, and parent analytics.</w:t>
+      </w:r>
+    </w:p>
+    <w:p>
+      <w:pPr>
+        <w:spacing w:before="24" w:after="0" w:line="240" w:lineRule="auto"/>
+      </w:pPr>
+      <w:r/>
+      <w:r>
+        <w:rPr>
+          <w:rFonts w:ascii="Times New Roman" w:hAnsi="Times New Roman"/>
+          <w:b/>
+          <w:i w:val="0"/>
+          <w:color w:val="000000"/>
+          <w:sz w:val="17"/>
+        </w:rPr>
+        <w:t xml:space="preserve">F1 Strategy &amp; Telemetry Analytics Dashboard </w:t>
+      </w:r>
+      <w:r>
+        <w:rPr>
+          <w:rFonts w:ascii="Times New Roman" w:hAnsi="Times New Roman"/>
+          <w:b w:val="0"/>
+          <w:i w:val="0"/>
+          <w:color w:val="000000"/>
+          <w:sz w:val="16"/>
+        </w:rPr>
+        <w:t xml:space="preserve">| Python, Plotly, FastF1, Streamlit | </w:t>
+      </w:r>
+      <w:hyperlink r:id="rId22">
+        <w:r>
+          <w:rPr>
+            <w:color w:val="000000"/>
+            <w:u w:val="single"/>
+            <w:sz w:val="16"/>
+            <w:rFonts w:ascii="Times New Roman" w:hAnsi="Times New Roman"/>
+          </w:rPr>
+          <w:t>[Live Demo]</w:t>
+        </w:r>
+      </w:hyperlink>
+    </w:p>
+    <w:p>
+      <w:pPr>
+        <w:spacing w:before="0" w:after="16" w:line="240" w:lineRule="auto"/>
+      </w:pPr>
+      <w:r/>
+      <w:r>
+        <w:rPr>
+          <w:rFonts w:ascii="Times New Roman" w:hAnsi="Times New Roman"/>
+          <w:b w:val="0"/>
+          <w:i w:val="0"/>
+          <w:color w:val="000000"/>
+          <w:sz w:val="16"/>
+        </w:rPr>
+        <w:t>• Visualized micro-sector speed telemetry, tyre degradation dynamics, and circuit grip evolution across Grand Prix sessions.</w:t>
+      </w:r>
+    </w:p>
+    <w:p>
+      <w:pPr>
+        <w:spacing w:before="24" w:after="0" w:line="240" w:lineRule="auto"/>
+      </w:pPr>
+      <w:r/>
+      <w:r>
+        <w:rPr>
+          <w:rFonts w:ascii="Times New Roman" w:hAnsi="Times New Roman"/>
+          <w:b/>
+          <w:i w:val="0"/>
+          <w:color w:val="000000"/>
+          <w:sz w:val="17"/>
+        </w:rPr>
+        <w:t xml:space="preserve">FarmSight – Crop Price &amp; Weather Correlation Analysis </w:t>
+      </w:r>
+      <w:r>
+        <w:rPr>
+          <w:rFonts w:ascii="Times New Roman" w:hAnsi="Times New Roman"/>
+          <w:b w:val="0"/>
+          <w:i w:val="0"/>
+          <w:color w:val="000000"/>
+          <w:sz w:val="16"/>
+        </w:rPr>
+        <w:t xml:space="preserve">| Python, Streamlit, Excel, Power BI | </w:t>
+      </w:r>
+      <w:hyperlink r:id="rId14">
+        <w:r>
+          <w:rPr>
+            <w:color w:val="000000"/>
+            <w:u w:val="single"/>
+            <w:sz w:val="16"/>
+            <w:rFonts w:ascii="Times New Roman" w:hAnsi="Times New Roman"/>
+          </w:rPr>
+          <w:t>[Live Demo]</w:t>
+        </w:r>
+      </w:hyperlink>
+    </w:p>
+    <w:p>
+      <w:pPr>
+        <w:spacing w:before="0" w:after="16" w:line="240" w:lineRule="auto"/>
+      </w:pPr>
+      <w:r/>
+      <w:r>
+        <w:rPr>
+          <w:rFonts w:ascii="Times New Roman" w:hAnsi="Times New Roman"/>
+          <w:b w:val="0"/>
+          <w:i w:val="0"/>
+          <w:color w:val="000000"/>
+          <w:sz w:val="16"/>
+        </w:rPr>
+        <w:t>• Correlated historical mandi crop spot prices with precipitation patterns to model price elasticity and seasonality trends.</w:t>
+      </w:r>
+    </w:p>
+    <w:p>
+      <w:pPr>
+        <w:spacing w:before="60" w:after="20" w:line="240" w:lineRule="auto"/>
+      </w:pPr>
+      <w:r>
+        <w:rPr>
+          <w:rFonts w:ascii="Times New Roman" w:hAnsi="Times New Roman"/>
+          <w:b/>
+          <w:i w:val="0"/>
+          <w:color w:val="000000"/>
+          <w:sz w:val="18"/>
+        </w:rPr>
+        <w:t>EDUCATION</w:t>
+      </w:r>
+    </w:p>
+    <w:p>
+      <w:pPr>
+        <w:spacing w:before="24" w:after="16" w:line="240" w:lineRule="auto"/>
+      </w:pPr>
+      <w:r/>
+      <w:r>
+        <w:rPr>
+          <w:rFonts w:ascii="Times New Roman" w:hAnsi="Times New Roman"/>
+          <w:b/>
+          <w:i w:val="0"/>
+          <w:color w:val="000000"/>
+          <w:sz w:val="17"/>
+        </w:rPr>
+        <w:t xml:space="preserve">B.Tech in Computer Science &amp; Engineering (AI &amp; ML) </w:t>
+      </w:r>
+      <w:r>
+        <w:rPr>
+          <w:rFonts w:ascii="Times New Roman" w:hAnsi="Times New Roman"/>
+          <w:b w:val="0"/>
+          <w:i w:val="0"/>
+          <w:color w:val="000000"/>
+          <w:sz w:val="17"/>
+        </w:rPr>
+        <w:t>— GNA University, Punjab</w:t>
+      </w:r>
+      <w:r>
+        <w:rPr>
+          <w:rFonts w:ascii="Times New Roman" w:hAnsi="Times New Roman"/>
+          <w:b/>
+          <w:i w:val="0"/>
+          <w:color w:val="000000"/>
+          <w:sz w:val="17"/>
+        </w:rPr>
+        <w:tab/>
+        <w:t>2023 – 2027</w:t>
+        <w:br/>
+      </w:r>
+      <w:r>
+        <w:rPr>
+          <w:rFonts w:ascii="Times New Roman" w:hAnsi="Times New Roman"/>
+          <w:b w:val="0"/>
+          <w:i w:val="0"/>
+          <w:color w:val="000000"/>
+          <w:sz w:val="16"/>
+        </w:rPr>
+        <w:t>Relevant Coursework: Data Warehousing &amp; Data Mining, Machine Learning, DBMS (SQL), Data Analytics, Data Structures &amp; Algorithms, Statistics &amp; Probability</w:t>
+      </w:r>
+    </w:p>
+    <w:p>
+      <w:pPr>
+        <w:pBdr>
+          <w:bottom w:val="single" w:sz="6" w:space="1" w:color="000000"/>
+        </w:pBdr>
+        <w:spacing w:before="60" w:after="20" w:line="240" w:lineRule="auto"/>
+      </w:pPr>
+      <w:r>
+        <w:rPr>
+          <w:rFonts w:ascii="Times New Roman" w:hAnsi="Times New Roman"/>
+          <w:b/>
+          <w:i w:val="0"/>
+          <w:color w:val="000000"/>
+          <w:sz w:val="18"/>
+        </w:rPr>
+        <w:t>CERTIFICATIONS &amp; TRAINING</w:t>
+      </w:r>
+    </w:p>
+    <w:p>
+      <w:pPr>
+        <w:spacing w:before="0" w:after="12" w:line="240" w:lineRule="auto"/>
+      </w:pPr>
+      <w:r/>
+      <w:r>
+        <w:rPr>
+          <w:rFonts w:ascii="Times New Roman" w:hAnsi="Times New Roman"/>
+          <w:b/>
+          <w:i w:val="0"/>
+          <w:color w:val="000000"/>
+          <w:sz w:val="17"/>
         </w:rPr>
         <w:t xml:space="preserve">• Microsoft Learn: </w:t>
       </w:r>
@@ -932,9 +1034,65 @@
           <w:b w:val="0"/>
           <w:i w:val="0"/>
           <w:color w:val="000000"/>
+          <w:sz w:val="16"/>
+        </w:rPr>
+        <w:t>Introduction to End-to-End Analytics using Microsoft Fabric | Clean, Transform &amp; Load Data in Power BI | Get Data with Power BI</w:t>
+      </w:r>
+    </w:p>
+    <w:p>
+      <w:pPr>
+        <w:pBdr>
+          <w:bottom w:val="single" w:sz="6" w:space="1" w:color="000000"/>
+        </w:pBdr>
+        <w:spacing w:before="0" w:after="12" w:line="240" w:lineRule="auto"/>
+      </w:pPr>
+      <w:r/>
+      <w:r>
+        <w:rPr>
+          <w:rFonts w:ascii="Times New Roman" w:hAnsi="Times New Roman"/>
+          <w:b/>
+          <w:i w:val="0"/>
+          <w:color w:val="000000"/>
           <w:sz w:val="17"/>
         </w:rPr>
-        <w:t>Introduction to End-to-End Analytics using Microsoft Fabric | Clean, Transform &amp; Load Data in Power BI | Get Data with Power BI</w:t>
+        <w:t xml:space="preserve">• Enterprise Simulations (Forage): </w:t>
+      </w:r>
+      <w:r>
+        <w:rPr>
+          <w:rFonts w:ascii="Times New Roman" w:hAnsi="Times New Roman"/>
+          <w:b w:val="0"/>
+          <w:i w:val="0"/>
+          <w:color w:val="000000"/>
+          <w:sz w:val="16"/>
+        </w:rPr>
+        <w:t>Deloitte Data Analytics | Tata GenAI-Powered Data Analytics</w:t>
+      </w:r>
+    </w:p>
+    <w:p>
+      <w:pPr>
+        <w:spacing w:after="12" w:line="240" w:lineRule="auto" w:before="0"/>
+        <w:ind w:left="173"/>
+      </w:pPr>
+      <w:r/>
+      <w:r>
+        <w:rPr>
+          <w:rFonts w:ascii="Times New Roman" w:hAnsi="Times New Roman"/>
+          <w:b/>
+          <w:i w:val="0"/>
+          <w:color w:val="000000"/>
+          <w:sz w:val="17"/>
+        </w:rPr>
+        <w:t xml:space="preserve">• Technical &amp; AI Credentials: </w:t>
+      </w:r>
+      <w:r>
+        <w:rPr>
+          <w:rFonts w:ascii="Times New Roman" w:hAnsi="Times New Roman"/>
+          <w:b w:val="0"/>
+          <w:i w:val="0"/>
+          <w:color w:val="000000"/>
+          <w:sz w:val="16"/>
+        </w:rPr>
+        <w:t>Govt. of India / NSDC Skill India Computer Vision (2026) | Be10x AI Tools &amp; ChatGPT (2026) | Python for Data Science</w:t>
       </w:r>
     </w:p>
     <w:p>
@@ -993,7 +1151,7 @@
     </w:p>
     <w:sectPr>
       <w:pgSz w:w="12240" w:h="15840"/>
-      <w:pgMar w:top="320" w:right="560" w:bottom="320" w:left="560" w:header="720" w:footer="720" w:gutter="0"/>
+      <w:pgMar w:top="280" w:right="520" w:bottom="280" w:left="520" w:header="720" w:footer="720" w:gutter="0"/>
       <w:cols w:space="720"/>
       <w:docGrid w:linePitch="360"/>
     </w:sectPr>

</xml_diff>